<commit_message>
docs: informe de la Guía 7 montado en la plantilla APA 7 de la UMB
Co-Authored-By: Claude Opus 5.5 <noreply@anthropic.com>
</commit_message>
<xml_diff>
--- a/docs/guia07/Informe_Guia07_Estandares_EcoRecicla_UMB.docx
+++ b/docs/guia07/Informe_Guia07_Estandares_EcoRecicla_UMB.docx
@@ -1,79 +1,268 @@
 
 <file path=word/document.xml><?xml version="1.0" encoding="utf-8"?>
-<w:document xmlns:wpc="http://schemas.microsoft.com/office/word/2010/wordprocessingCanvas" xmlns:mc="http://schemas.openxmlformats.org/markup-compatibility/2006" xmlns:o="urn:schemas-microsoft-com:office:office" xmlns:r="http://schemas.openxmlformats.org/officeDocument/2006/relationships" xmlns:m="http://schemas.openxmlformats.org/officeDocument/2006/math" xmlns:v="urn:schemas-microsoft-com:vml" xmlns:wp14="http://schemas.microsoft.com/office/word/2010/wordprocessingDrawing" xmlns:wp="http://schemas.openxmlformats.org/drawingml/2006/wordprocessingDrawing" xmlns:w10="urn:schemas-microsoft-com:office:word" xmlns:w="http://schemas.openxmlformats.org/wordprocessingml/2006/main" xmlns:w14="http://schemas.microsoft.com/office/word/2010/wordml" xmlns:w15="http://schemas.microsoft.com/office/word/2012/wordml" xmlns:wpg="http://schemas.microsoft.com/office/word/2010/wordprocessingGroup" xmlns:wpi="http://schemas.microsoft.com/office/word/2010/wordprocessingInk" xmlns:wne="http://schemas.microsoft.com/office/word/2006/wordml" xmlns:wps="http://schemas.microsoft.com/office/word/2010/wordprocessingShape" xmlns:cx="http://schemas.microsoft.com/office/drawing/2014/chartex" xmlns:cx1="http://schemas.microsoft.com/office/drawing/2015/9/8/chartex" xmlns:cx2="http://schemas.microsoft.com/office/drawing/2015/10/21/chartex" xmlns:cx3="http://schemas.microsoft.com/office/drawing/2016/5/9/chartex" xmlns:cx4="http://schemas.microsoft.com/office/drawing/2016/5/10/chartex" xmlns:cx5="http://schemas.microsoft.com/office/drawing/2016/5/11/chartex" xmlns:cx6="http://schemas.microsoft.com/office/drawing/2016/5/12/chartex" xmlns:cx7="http://schemas.microsoft.com/office/drawing/2016/5/13/chartex" xmlns:cx8="http://schemas.microsoft.com/office/drawing/2016/5/14/chartex" xmlns:aink="http://schemas.microsoft.com/office/drawing/2016/ink" xmlns:am3d="http://schemas.microsoft.com/office/drawing/2017/model3d" xmlns:w16cex="http://schemas.microsoft.com/office/word/2018/wordml/cex" xmlns:w16cid="http://schemas.microsoft.com/office/word/2016/wordml/cid" xmlns:w16="http://schemas.microsoft.com/office/word/2018/wordml" xmlns:w16sdtdh="http://schemas.microsoft.com/office/word/2020/wordml/sdtdatahash" xmlns:w16se="http://schemas.microsoft.com/office/word/2015/wordml/symex" mc:Ignorable="w14 w15 wp14">
+<w:document xmlns:pic="http://schemas.openxmlformats.org/drawingml/2006/picture" xmlns:a="http://schemas.openxmlformats.org/drawingml/2006/main" xmlns:wpc="http://schemas.microsoft.com/office/word/2010/wordprocessingCanvas" xmlns:cx="http://schemas.microsoft.com/office/drawing/2014/chartex" xmlns:cx1="http://schemas.microsoft.com/office/drawing/2015/9/8/chartex" xmlns:cx2="http://schemas.microsoft.com/office/drawing/2015/10/21/chartex" xmlns:cx3="http://schemas.microsoft.com/office/drawing/2016/5/9/chartex" xmlns:cx4="http://schemas.microsoft.com/office/drawing/2016/5/10/chartex" xmlns:cx5="http://schemas.microsoft.com/office/drawing/2016/5/11/chartex" xmlns:cx6="http://schemas.microsoft.com/office/drawing/2016/5/12/chartex" xmlns:cx7="http://schemas.microsoft.com/office/drawing/2016/5/13/chartex" xmlns:cx8="http://schemas.microsoft.com/office/drawing/2016/5/14/chartex" xmlns:mc="http://schemas.openxmlformats.org/markup-compatibility/2006" xmlns:aink="http://schemas.microsoft.com/office/drawing/2016/ink" xmlns:am3d="http://schemas.microsoft.com/office/drawing/2017/model3d" xmlns:o="urn:schemas-microsoft-com:office:office" xmlns:r="http://schemas.openxmlformats.org/officeDocument/2006/relationships" xmlns:m="http://schemas.openxmlformats.org/officeDocument/2006/math" xmlns:v="urn:schemas-microsoft-com:vml" xmlns:wp14="http://schemas.microsoft.com/office/word/2010/wordprocessingDrawing" xmlns:wp="http://schemas.openxmlformats.org/drawingml/2006/wordprocessingDrawing" xmlns:w10="urn:schemas-microsoft-com:office:word" xmlns:w="http://schemas.openxmlformats.org/wordprocessingml/2006/main" xmlns:w14="http://schemas.microsoft.com/office/word/2010/wordml" xmlns:w15="http://schemas.microsoft.com/office/word/2012/wordml" xmlns:w16cex="http://schemas.microsoft.com/office/word/2018/wordml/cex" xmlns:w16cid="http://schemas.microsoft.com/office/word/2016/wordml/cid" xmlns:w16="http://schemas.microsoft.com/office/word/2018/wordml" xmlns:w16sdtdh="http://schemas.microsoft.com/office/word/2020/wordml/sdtdatahash" xmlns:w16se="http://schemas.microsoft.com/office/word/2015/wordml/symex" xmlns:wpg="http://schemas.microsoft.com/office/word/2010/wordprocessingGroup" xmlns:wpi="http://schemas.microsoft.com/office/word/2010/wordprocessingInk" xmlns:wne="http://schemas.microsoft.com/office/word/2006/wordml" xmlns:wps="http://schemas.microsoft.com/office/word/2010/wordprocessingShape" mc:Ignorable="w14 w15 w16se w16cid w16 w16cex w16sdtdh wp14">
   <w:body>
-    <w:p/>
-    <w:p/>
-    <w:p/>
     <w:p>
       <w:pPr>
-        <w:jc w:val="center"/>
+        <w:rPr>
+          <w:rFonts w:ascii="Times New Roman" w:hAnsi="Times New Roman" w:cs="Times New Roman"/>
+          <w:sz w:val="24"/>
+          <w:szCs w:val="24"/>
+        </w:rPr>
       </w:pPr>
       <w:r>
         <w:rPr>
-          <w:b/>
-          <w:bCs/>
+          <w:rFonts w:ascii="Times New Roman" w:hAnsi="Times New Roman" w:cs="Times New Roman"/>
+          <w:noProof/>
+          <w:sz w:val="24"/>
+          <w:szCs w:val="24"/>
         </w:rPr>
-        <w:t xml:space="preserve">Guía de Laboratorio N.º 7: Control de Versiones, Pruebas de Software y Norma ISO 9000 Aplicados al Proyecto EcoRecicla</w:t>
-      </w:r>
-    </w:p>
-    <w:p/>
-    <w:p>
-      <w:pPr>
-        <w:jc w:val="center"/>
-      </w:pPr>
-      <w:r>
-        <w:t xml:space="preserve">David Alejandro Zambrano Arguello (código 1034659868)</w:t>
+        <w:drawing>
+          <wp:inline distT="0" distB="0" distL="0" distR="0" wp14:anchorId="3EC48EF7" wp14:editId="0DB58B04">
+            <wp:extent cx="5974715" cy="1505585"/>
+            <wp:effectExtent l="0" t="0" r="6985" b="0"/>
+            <wp:docPr id="1070595122" name="Imagen 9"/>
+            <wp:cNvGraphicFramePr>
+              <a:graphicFrameLocks xmlns:a="http://schemas.openxmlformats.org/drawingml/2006/main" noChangeAspect="1"/>
+            </wp:cNvGraphicFramePr>
+            <a:graphic xmlns:a="http://schemas.openxmlformats.org/drawingml/2006/main">
+              <a:graphicData uri="http://schemas.openxmlformats.org/drawingml/2006/picture">
+                <pic:pic xmlns:pic="http://schemas.openxmlformats.org/drawingml/2006/picture">
+                  <pic:nvPicPr>
+                    <pic:cNvPr id="0" name="Picture 2"/>
+                    <pic:cNvPicPr>
+                      <a:picLocks noChangeAspect="1" noChangeArrowheads="1"/>
+                    </pic:cNvPicPr>
+                  </pic:nvPicPr>
+                  <pic:blipFill>
+                    <a:blip r:embed="rId6">
+                      <a:extLst>
+                        <a:ext uri="{28A0092B-C50C-407E-A947-70E740481C1C}">
+                          <a14:useLocalDpi xmlns:a14="http://schemas.microsoft.com/office/drawing/2010/main" val="0"/>
+                        </a:ext>
+                      </a:extLst>
+                    </a:blip>
+                    <a:srcRect/>
+                    <a:stretch>
+                      <a:fillRect/>
+                    </a:stretch>
+                  </pic:blipFill>
+                  <pic:spPr bwMode="auto">
+                    <a:xfrm>
+                      <a:off x="0" y="0"/>
+                      <a:ext cx="5974715" cy="1505585"/>
+                    </a:xfrm>
+                    <a:prstGeom prst="rect">
+                      <a:avLst/>
+                    </a:prstGeom>
+                    <a:noFill/>
+                  </pic:spPr>
+                </pic:pic>
+              </a:graphicData>
+            </a:graphic>
+          </wp:inline>
+        </w:drawing>
       </w:r>
     </w:p>
     <w:p>
       <w:pPr>
-        <w:jc w:val="center"/>
+        <w:spacing w:line="480" w:lineRule="auto"/>
+        <w:rPr>
+          <w:rFonts w:ascii="Times New Roman" w:hAnsi="Times New Roman" w:cs="Times New Roman"/>
+          <w:sz w:val="24"/>
+          <w:szCs w:val="24"/>
+        </w:rPr>
       </w:pPr>
-      <w:r>
-        <w:t xml:space="preserve">Samuel Ossa Escobar (código [pendiente])</w:t>
-      </w:r>
     </w:p>
     <w:p>
       <w:pPr>
+        <w:spacing w:line="480" w:lineRule="auto"/>
         <w:jc w:val="center"/>
+        <w:rPr>
+          <w:rFonts w:ascii="Times New Roman" w:hAnsi="Times New Roman" w:cs="Times New Roman"/>
+          <w:sz w:val="24"/>
+          <w:szCs w:val="24"/>
+        </w:rPr>
       </w:pPr>
-      <w:r>
-        <w:t xml:space="preserve">Facultad de Ingeniería, Universidad Manuela Beltrán</w:t>
-      </w:r>
     </w:p>
     <w:p>
       <w:pPr>
-        <w:jc w:val="center"/>
+        <w:spacing w:line="480" w:lineRule="auto"/>
+        <w:rPr>
+          <w:rFonts w:ascii="Times New Roman" w:hAnsi="Times New Roman" w:cs="Times New Roman"/>
+          <w:sz w:val="24"/>
+          <w:szCs w:val="24"/>
+        </w:rPr>
       </w:pPr>
-      <w:r>
-        <w:t xml:space="preserve">Estándares y Métricas de Calidad de Software</w:t>
-      </w:r>
     </w:p>
     <w:p>
       <w:pPr>
+        <w:spacing w:line="480" w:lineRule="auto"/>
         <w:jc w:val="center"/>
+        <w:rPr>
+          <w:rFonts w:ascii="Times New Roman" w:hAnsi="Times New Roman" w:cs="Times New Roman"/>
+          <w:sz w:val="24"/>
+          <w:szCs w:val="24"/>
+        </w:rPr>
       </w:pPr>
       <w:r>
-        <w:t xml:space="preserve">Docente: Mauricio Morales Meneses</w:t>
+        <w:rPr>
+          <w:rFonts w:ascii="Times New Roman" w:hAnsi="Times New Roman" w:cs="Times New Roman"/>
+          <w:b/>
+          <w:bCs/>
+          <w:sz w:val="24"/>
+          <w:szCs w:val="24"/>
+        </w:rPr>
+        <w:t xml:space="preserve">Guía de Laboratorio N.º 7: Control de Versiones, Pruebas de Software y Norma ISO 9000 Aplicados al Proyecto EcoRecicla</w:t>
       </w:r>
     </w:p>
     <w:p>
       <w:pPr>
+        <w:spacing w:line="480" w:lineRule="auto"/>
         <w:jc w:val="center"/>
+        <w:rPr>
+          <w:rFonts w:ascii="Times New Roman" w:hAnsi="Times New Roman" w:cs="Times New Roman"/>
+          <w:sz w:val="24"/>
+          <w:szCs w:val="24"/>
+        </w:rPr>
       </w:pPr>
-      <w:r>
-        <w:t xml:space="preserve">25 de octubre de 2026</w:t>
-      </w:r>
-    </w:p>
-    <w:p>
-      <w:r>
-        <w:br w:type="page"/>
-      </w:r>
     </w:p>
     <w:p>
       <w:pPr>
-        <w:pStyle w:val="Heading1"/>
+        <w:spacing w:line="480" w:lineRule="auto"/>
+        <w:jc w:val="center"/>
+        <w:rPr>
+          <w:rFonts w:ascii="Times New Roman" w:hAnsi="Times New Roman" w:cs="Times New Roman"/>
+          <w:sz w:val="24"/>
+          <w:szCs w:val="24"/>
+        </w:rPr>
+      </w:pPr>
+      <w:r>
+        <w:rPr>
+          <w:rFonts w:ascii="Times New Roman" w:hAnsi="Times New Roman" w:cs="Times New Roman"/>
+          <w:sz w:val="24"/>
+          <w:szCs w:val="24"/>
+        </w:rPr>
+        <w:t xml:space="preserve">David Alejandro Zambrano Arguello (1034659868), Samuel Ossa Escobar ([código pendiente]).</w:t>
+      </w:r>
+    </w:p>
+    <w:p>
+      <w:pPr>
+        <w:spacing w:line="480" w:lineRule="auto"/>
+        <w:jc w:val="center"/>
+        <w:rPr>
+          <w:rFonts w:ascii="Times New Roman" w:hAnsi="Times New Roman" w:cs="Times New Roman"/>
+          <w:sz w:val="24"/>
+          <w:szCs w:val="24"/>
+        </w:rPr>
+      </w:pPr>
+    </w:p>
+    <w:p>
+      <w:pPr>
+        <w:spacing w:line="480" w:lineRule="auto"/>
+        <w:jc w:val="center"/>
+        <w:rPr>
+          <w:rFonts w:ascii="Times New Roman" w:hAnsi="Times New Roman" w:cs="Times New Roman"/>
+          <w:sz w:val="24"/>
+          <w:szCs w:val="24"/>
+        </w:rPr>
+      </w:pPr>
+      <w:r>
+        <w:rPr>
+          <w:rFonts w:ascii="Times New Roman" w:hAnsi="Times New Roman" w:cs="Times New Roman"/>
+          <w:sz w:val="24"/>
+          <w:szCs w:val="24"/>
+        </w:rPr>
+        <w:t xml:space="preserve">Universidad Manuela Beltrán</w:t>
+      </w:r>
+    </w:p>
+    <w:p>
+      <w:pPr>
+        <w:spacing w:line="480" w:lineRule="auto"/>
+        <w:jc w:val="center"/>
+        <w:rPr>
+          <w:rFonts w:ascii="Times New Roman" w:hAnsi="Times New Roman" w:cs="Times New Roman"/>
+          <w:sz w:val="24"/>
+          <w:szCs w:val="24"/>
+        </w:rPr>
+      </w:pPr>
+      <w:r>
+        <w:rPr>
+          <w:rFonts w:ascii="Times New Roman" w:hAnsi="Times New Roman" w:cs="Times New Roman"/>
+          <w:sz w:val="24"/>
+          <w:szCs w:val="24"/>
+        </w:rPr>
+        <w:t xml:space="preserve">Estándares y Métricas de Calidad de Software</w:t>
+      </w:r>
+    </w:p>
+    <w:p>
+      <w:pPr>
+        <w:spacing w:line="480" w:lineRule="auto"/>
+        <w:jc w:val="center"/>
+        <w:rPr>
+          <w:rFonts w:ascii="Times New Roman" w:hAnsi="Times New Roman" w:cs="Times New Roman"/>
+          <w:sz w:val="24"/>
+          <w:szCs w:val="24"/>
+        </w:rPr>
+      </w:pPr>
+      <w:r>
+        <w:rPr>
+          <w:rFonts w:ascii="Times New Roman" w:hAnsi="Times New Roman" w:cs="Times New Roman"/>
+          <w:sz w:val="24"/>
+          <w:szCs w:val="24"/>
+        </w:rPr>
+        <w:t xml:space="preserve">Mauricio Morales Meneses</w:t>
+      </w:r>
+    </w:p>
+    <w:p>
+      <w:pPr>
+        <w:spacing w:line="480" w:lineRule="auto"/>
+        <w:jc w:val="center"/>
+        <w:rPr>
+          <w:rFonts w:ascii="Times New Roman" w:hAnsi="Times New Roman" w:cs="Times New Roman"/>
+          <w:sz w:val="24"/>
+          <w:szCs w:val="24"/>
+        </w:rPr>
+      </w:pPr>
+      <w:r>
+        <w:rPr>
+          <w:rFonts w:ascii="Times New Roman" w:hAnsi="Times New Roman" w:cs="Times New Roman"/>
+          <w:sz w:val="24"/>
+          <w:szCs w:val="24"/>
+        </w:rPr>
+        <w:t xml:space="preserve">25/10/2026</w:t>
+      </w:r>
+    </w:p>
+    <w:p>
+      <w:pPr>
+        <w:spacing w:line="480" w:lineRule="auto"/>
+        <w:jc w:val="center"/>
+        <w:rPr>
+          <w:rFonts w:ascii="Times New Roman" w:hAnsi="Times New Roman" w:cs="Times New Roman"/>
+          <w:sz w:val="24"/>
+          <w:szCs w:val="24"/>
+        </w:rPr>
+      </w:pPr>
+    </w:p>
+    <w:p>
+      <w:pPr>
+        <w:spacing w:line="480" w:lineRule="auto"/>
+        <w:jc w:val="center"/>
+        <w:rPr>
+          <w:rFonts w:ascii="Times New Roman" w:hAnsi="Times New Roman" w:cs="Times New Roman"/>
+          <w:sz w:val="24"/>
+          <w:szCs w:val="24"/>
+        </w:rPr>
+      </w:pPr>
+    </w:p>
+    <w:p>
+      <w:r>
+        <w:br w:type="page"/>
+      </w:r>
+    </w:p>
+    <w:p>
+      <w:pPr>
+        <w:pStyle w:val="Ttulo1"/>
       </w:pPr>
       <w:r>
         <w:t xml:space="preserve">Resumen Ejecutivo</w:t>
@@ -125,7 +314,7 @@
     </w:p>
     <w:p>
       <w:pPr>
-        <w:pStyle w:val="Heading1"/>
+        <w:pStyle w:val="Ttulo1"/>
       </w:pPr>
       <w:r>
         <w:t xml:space="preserve">1. Introducción</w:t>
@@ -149,7 +338,7 @@
     </w:p>
     <w:p>
       <w:pPr>
-        <w:pStyle w:val="Heading2"/>
+        <w:pStyle w:val="Ttulo2"/>
       </w:pPr>
       <w:r>
         <w:t xml:space="preserve">1.1 Objetivo General</w:t>
@@ -165,7 +354,7 @@
     </w:p>
     <w:p>
       <w:pPr>
-        <w:pStyle w:val="Heading2"/>
+        <w:pStyle w:val="Ttulo2"/>
       </w:pPr>
       <w:r>
         <w:t xml:space="preserve">1.2 Objetivos Específicos</w:t>
@@ -229,7 +418,7 @@
     </w:p>
     <w:p>
       <w:pPr>
-        <w:pStyle w:val="Heading1"/>
+        <w:pStyle w:val="Ttulo1"/>
       </w:pPr>
       <w:r>
         <w:t xml:space="preserve">2. Marco Conceptual</w:t>
@@ -237,7 +426,7 @@
     </w:p>
     <w:p>
       <w:pPr>
-        <w:pStyle w:val="Heading2"/>
+        <w:pStyle w:val="Ttulo2"/>
       </w:pPr>
       <w:r>
         <w:t xml:space="preserve">2.1 Administración de Configuraciones</w:t>
@@ -286,7 +475,7 @@
     </w:p>
     <w:p>
       <w:pPr>
-        <w:pStyle w:val="Heading2"/>
+        <w:pStyle w:val="Ttulo2"/>
       </w:pPr>
       <w:r>
         <w:t xml:space="preserve">2.2 Control de Cambios</w:t>
@@ -302,7 +491,7 @@
     </w:p>
     <w:p>
       <w:pPr>
-        <w:pStyle w:val="Heading2"/>
+        <w:pStyle w:val="Ttulo2"/>
       </w:pPr>
       <w:r>
         <w:t xml:space="preserve">2.3 Mejora Continua</w:t>
@@ -318,7 +507,7 @@
     </w:p>
     <w:p>
       <w:pPr>
-        <w:pStyle w:val="Heading1"/>
+        <w:pStyle w:val="Ttulo1"/>
       </w:pPr>
       <w:r>
         <w:t xml:space="preserve">3. Sesión 1: Control de Versiones con Git y GitHub</w:t>
@@ -1571,7 +1760,7 @@
     </w:p>
     <w:p>
       <w:pPr>
-        <w:pStyle w:val="Heading2"/>
+        <w:pStyle w:val="Ttulo2"/>
       </w:pPr>
       <w:r>
         <w:t xml:space="preserve">3.1 Pull Requests y Revisión</w:t>
@@ -1620,7 +1809,7 @@
           <wp:inline distT="0" distB="0" distL="0" distR="0">
             <wp:extent cx="5715000" cy="2600325"/>
             <wp:effectExtent t="0" r="0" b="0" l="0"/>
-            <wp:docPr id="1" name="Figura 1" descr="Pull requests fusionados en el repositorio de EcoRecicla" title="Pull requests fusionados en el repositorio de EcoRecicla"/>
+            <wp:docPr id="101" name="Figura 1" descr="Pull requests fusionados en el repositorio de EcoRecicla" title="Pull requests fusionados en el repositorio de EcoRecicla"/>
             <wp:cNvGraphicFramePr>
               <a:graphicFrameLocks xmlns:a="http://schemas.openxmlformats.org/drawingml/2006/main" noChangeAspect="1"/>
             </wp:cNvGraphicFramePr>
@@ -1634,7 +1823,7 @@
                     </pic:cNvPicPr>
                   </pic:nvPicPr>
                   <pic:blipFill>
-                    <a:blip r:embed="rId8" cstate="none"/>
+                    <a:blip r:embed="rIdFig1" cstate="none"/>
                     <a:srcRect/>
                     <a:stretch>
                       <a:fillRect/>
@@ -1679,7 +1868,7 @@
     </w:p>
     <w:p>
       <w:pPr>
-        <w:pStyle w:val="Heading2"/>
+        <w:pStyle w:val="Ttulo2"/>
       </w:pPr>
       <w:r>
         <w:t xml:space="preserve">3.2 Simulación y Resolución del Conflicto</w:t>
@@ -1940,7 +2129,7 @@
           <wp:inline distT="0" distB="0" distL="0" distR="0">
             <wp:extent cx="5715000" cy="3086100"/>
             <wp:effectExtent t="0" r="0" b="0" l="0"/>
-            <wp:docPr id="2" name="Figura 2" descr="Pull request #3 con el commit que resuelve el conflicto" title="Pull request #3 con el commit que resuelve el conflicto"/>
+            <wp:docPr id="102" name="Figura 2" descr="Pull request #3 con el commit que resuelve el conflicto" title="Pull request #3 con el commit que resuelve el conflicto"/>
             <wp:cNvGraphicFramePr>
               <a:graphicFrameLocks xmlns:a="http://schemas.openxmlformats.org/drawingml/2006/main" noChangeAspect="1"/>
             </wp:cNvGraphicFramePr>
@@ -1954,7 +2143,7 @@
                     </pic:cNvPicPr>
                   </pic:nvPicPr>
                   <pic:blipFill>
-                    <a:blip r:embed="rId9" cstate="none"/>
+                    <a:blip r:embed="rIdFig2" cstate="none"/>
                     <a:srcRect/>
                     <a:stretch>
                       <a:fillRect/>
@@ -2032,7 +2221,7 @@
           <wp:inline distT="0" distB="0" distL="0" distR="0">
             <wp:extent cx="5715000" cy="2133600"/>
             <wp:effectExtent t="0" r="0" b="0" l="0"/>
-            <wp:docPr id="3" name="Figura 3" descr="Grafo de ramas del repositorio (Insights &gt; Network)" title="Grafo de ramas del repositorio (Insights &gt; Network)"/>
+            <wp:docPr id="103" name="Figura 3" descr="Grafo de ramas del repositorio (Insights &gt; Network)" title="Grafo de ramas del repositorio (Insights &gt; Network)"/>
             <wp:cNvGraphicFramePr>
               <a:graphicFrameLocks xmlns:a="http://schemas.openxmlformats.org/drawingml/2006/main" noChangeAspect="1"/>
             </wp:cNvGraphicFramePr>
@@ -2046,7 +2235,7 @@
                     </pic:cNvPicPr>
                   </pic:nvPicPr>
                   <pic:blipFill>
-                    <a:blip r:embed="rId10" cstate="none"/>
+                    <a:blip r:embed="rIdFig3" cstate="none"/>
                     <a:srcRect/>
                     <a:stretch>
                       <a:fillRect/>
@@ -2099,7 +2288,7 @@
     </w:p>
     <w:p>
       <w:pPr>
-        <w:pStyle w:val="Heading1"/>
+        <w:pStyle w:val="Ttulo1"/>
       </w:pPr>
       <w:r>
         <w:t xml:space="preserve">4. Sesiones 2 y 3: Práctica de Pruebas</w:t>
@@ -2115,7 +2304,7 @@
     </w:p>
     <w:p>
       <w:pPr>
-        <w:pStyle w:val="Heading2"/>
+        <w:pStyle w:val="Ttulo2"/>
       </w:pPr>
       <w:r>
         <w:t xml:space="preserve">4.1 Plan de Pruebas PP-ECO-001 (Versión 1.1)</w:t>
@@ -4509,7 +4698,7 @@
     </w:p>
     <w:p>
       <w:pPr>
-        <w:pStyle w:val="Heading2"/>
+        <w:pStyle w:val="Ttulo2"/>
       </w:pPr>
       <w:r>
         <w:t xml:space="preserve">4.2 Entorno de Pruebas Aislado</w:t>
@@ -4621,7 +4810,7 @@
     </w:p>
     <w:p>
       <w:pPr>
-        <w:pStyle w:val="Heading2"/>
+        <w:pStyle w:val="Ttulo2"/>
       </w:pPr>
       <w:r>
         <w:t xml:space="preserve">4.3 Escenarios de Prueba y Resultados de Ejecución</w:t>
@@ -8303,7 +8492,7 @@
     </w:p>
     <w:p>
       <w:pPr>
-        <w:pStyle w:val="Heading2"/>
+        <w:pStyle w:val="Ttulo2"/>
       </w:pPr>
       <w:r>
         <w:t xml:space="preserve">4.4 Gestión de Defectos</w:t>
@@ -9327,7 +9516,7 @@
           <wp:inline distT="0" distB="0" distL="0" distR="0">
             <wp:extent cx="4953000" cy="3905250"/>
             <wp:effectExtent t="0" r="0" b="0" l="0"/>
-            <wp:docPr id="4" name="Figura 4" descr="Reporte del defecto DEF-01 en GitHub Issues" title="Reporte del defecto DEF-01 en GitHub Issues"/>
+            <wp:docPr id="104" name="Figura 4" descr="Reporte del defecto DEF-01 en GitHub Issues" title="Reporte del defecto DEF-01 en GitHub Issues"/>
             <wp:cNvGraphicFramePr>
               <a:graphicFrameLocks xmlns:a="http://schemas.openxmlformats.org/drawingml/2006/main" noChangeAspect="1"/>
             </wp:cNvGraphicFramePr>
@@ -9341,7 +9530,7 @@
                     </pic:cNvPicPr>
                   </pic:nvPicPr>
                   <pic:blipFill>
-                    <a:blip r:embed="rId11" cstate="none"/>
+                    <a:blip r:embed="rIdFig4" cstate="none"/>
                     <a:srcRect/>
                     <a:stretch>
                       <a:fillRect/>
@@ -9405,7 +9594,7 @@
     </w:p>
     <w:p>
       <w:pPr>
-        <w:pStyle w:val="Heading2"/>
+        <w:pStyle w:val="Ttulo2"/>
       </w:pPr>
       <w:r>
         <w:t xml:space="preserve">4.5 Corrección y Re-prueba</w:t>
@@ -10395,7 +10584,7 @@
           <wp:inline distT="0" distB="0" distL="0" distR="0">
             <wp:extent cx="5334000" cy="3952875"/>
             <wp:effectExtent t="0" r="0" b="0" l="0"/>
-            <wp:docPr id="5" name="Figura 5" descr="Historial de ejecuciones del flujo de pruebas en GitHub Actions" title="Historial de ejecuciones del flujo de pruebas en GitHub Actions"/>
+            <wp:docPr id="105" name="Figura 5" descr="Historial de ejecuciones del flujo de pruebas en GitHub Actions" title="Historial de ejecuciones del flujo de pruebas en GitHub Actions"/>
             <wp:cNvGraphicFramePr>
               <a:graphicFrameLocks xmlns:a="http://schemas.openxmlformats.org/drawingml/2006/main" noChangeAspect="1"/>
             </wp:cNvGraphicFramePr>
@@ -10409,7 +10598,7 @@
                     </pic:cNvPicPr>
                   </pic:nvPicPr>
                   <pic:blipFill>
-                    <a:blip r:embed="rId12" cstate="none"/>
+                    <a:blip r:embed="rIdFig5" cstate="none"/>
                     <a:srcRect/>
                     <a:stretch>
                       <a:fillRect/>
@@ -10454,7 +10643,7 @@
     </w:p>
     <w:p>
       <w:pPr>
-        <w:pStyle w:val="Heading2"/>
+        <w:pStyle w:val="Ttulo2"/>
       </w:pPr>
       <w:r>
         <w:t xml:space="preserve">4.6 Métricas del Proceso de Pruebas</w:t>
@@ -11778,7 +11967,7 @@
     </w:p>
     <w:p>
       <w:pPr>
-        <w:pStyle w:val="Heading2"/>
+        <w:pStyle w:val="Ttulo2"/>
       </w:pPr>
       <w:r>
         <w:t xml:space="preserve">4.7 Programas Fuente (Algoritmos)</w:t>
@@ -13480,7 +13669,7 @@
     </w:p>
     <w:p>
       <w:pPr>
-        <w:pStyle w:val="Heading1"/>
+        <w:pStyle w:val="Ttulo1"/>
       </w:pPr>
       <w:r>
         <w:t xml:space="preserve">5. Sesión 4: Exposición sobre la Norma ISO 9000</w:t>
@@ -14632,7 +14821,7 @@
           <wp:inline distT="0" distB="0" distL="0" distR="0">
             <wp:extent cx="4000500" cy="5715000"/>
             <wp:effectExtent t="0" r="0" b="0" l="0"/>
-            <wp:docPr id="6" name="Figura 6" descr="Diapositivas de la exposición" title="Diapositivas de la exposición"/>
+            <wp:docPr id="106" name="Figura 6" descr="Diapositivas de la exposición" title="Diapositivas de la exposición"/>
             <wp:cNvGraphicFramePr>
               <a:graphicFrameLocks xmlns:a="http://schemas.openxmlformats.org/drawingml/2006/main" noChangeAspect="1"/>
             </wp:cNvGraphicFramePr>
@@ -14646,7 +14835,7 @@
                     </pic:cNvPicPr>
                   </pic:nvPicPr>
                   <pic:blipFill>
-                    <a:blip r:embed="rId13" cstate="none"/>
+                    <a:blip r:embed="rIdFig6" cstate="none"/>
                     <a:srcRect/>
                     <a:stretch>
                       <a:fillRect/>
@@ -14691,7 +14880,7 @@
     </w:p>
     <w:p>
       <w:pPr>
-        <w:pStyle w:val="Heading1"/>
+        <w:pStyle w:val="Ttulo1"/>
       </w:pPr>
       <w:r>
         <w:t xml:space="preserve">6. Independent Work Activity (Answers in English)</w:t>
@@ -14699,7 +14888,7 @@
     </w:p>
     <w:p>
       <w:pPr>
-        <w:pStyle w:val="Heading2"/>
+        <w:pStyle w:val="Ttulo2"/>
       </w:pPr>
       <w:r>
         <w:t xml:space="preserve">6.1 What Is ISO in General Terms? Do All ISO Standards Follow the High-Level Structure?</w:t>
@@ -14723,7 +14912,7 @@
     </w:p>
     <w:p>
       <w:pPr>
-        <w:pStyle w:val="Heading2"/>
+        <w:pStyle w:val="Ttulo2"/>
       </w:pPr>
       <w:r>
         <w:t xml:space="preserve">6.2 ISO Standards Related to the Software Product and Process</w:t>
@@ -15812,7 +16001,7 @@
     </w:p>
     <w:p>
       <w:pPr>
-        <w:pStyle w:val="Heading2"/>
+        <w:pStyle w:val="Ttulo2"/>
       </w:pPr>
       <w:r>
         <w:t xml:space="preserve">6.3 Companies in Colombia With ISO and CMMI Certifications</w:t>
@@ -16257,7 +16446,7 @@
     </w:p>
     <w:p>
       <w:pPr>
-        <w:pStyle w:val="Heading2"/>
+        <w:pStyle w:val="Ttulo2"/>
       </w:pPr>
       <w:r>
         <w:t xml:space="preserve">6.4 Three of the Most Recognized Software Development Companies in Colombia</w:t>
@@ -16273,7 +16462,7 @@
     </w:p>
     <w:p>
       <w:pPr>
-        <w:pStyle w:val="Heading2"/>
+        <w:pStyle w:val="Ttulo2"/>
       </w:pPr>
       <w:r>
         <w:t xml:space="preserve">6.5 How Do These Certifications Relate to Software Testing?</w:t>
@@ -16297,7 +16486,7 @@
     </w:p>
     <w:p>
       <w:pPr>
-        <w:pStyle w:val="Heading1"/>
+        <w:pStyle w:val="Ttulo1"/>
       </w:pPr>
       <w:r>
         <w:t xml:space="preserve">7. Actividad de Comprobación del Trabajo Autónomo</w:t>
@@ -16336,7 +16525,7 @@
     </w:p>
     <w:p>
       <w:pPr>
-        <w:pStyle w:val="Heading1"/>
+        <w:pStyle w:val="Ttulo1"/>
       </w:pPr>
       <w:r>
         <w:t xml:space="preserve">8. Preguntas Orientadoras</w:t>
@@ -16344,7 +16533,7 @@
     </w:p>
     <w:p>
       <w:pPr>
-        <w:pStyle w:val="Heading2"/>
+        <w:pStyle w:val="Ttulo2"/>
       </w:pPr>
       <w:r>
         <w:t xml:space="preserve">8.1 Análisis de los Datos Obtenidos</w:t>
@@ -16368,7 +16557,7 @@
     </w:p>
     <w:p>
       <w:pPr>
-        <w:pStyle w:val="Heading2"/>
+        <w:pStyle w:val="Ttulo2"/>
       </w:pPr>
       <w:r>
         <w:t xml:space="preserve">8.2 ¿Cuáles Fueron los Aprendizajes Obtenidos?</w:t>
@@ -16460,7 +16649,7 @@
     </w:p>
     <w:p>
       <w:pPr>
-        <w:pStyle w:val="Heading2"/>
+        <w:pStyle w:val="Ttulo2"/>
       </w:pPr>
       <w:r>
         <w:t xml:space="preserve">8.3 ¿Dónde se Presentó Mayor Dificultad y Cómo se Resolvió?</w:t>
@@ -16607,7 +16796,7 @@
     </w:p>
     <w:p>
       <w:pPr>
-        <w:pStyle w:val="Heading1"/>
+        <w:pStyle w:val="Ttulo1"/>
       </w:pPr>
       <w:r>
         <w:t xml:space="preserve">9. Evidencias del Trabajo</w:t>
@@ -17311,7 +17500,7 @@
     </w:p>
     <w:p>
       <w:pPr>
-        <w:pStyle w:val="Heading1"/>
+        <w:pStyle w:val="Ttulo1"/>
       </w:pPr>
       <w:r>
         <w:t xml:space="preserve">10. Conclusiones</w:t>
@@ -17348,7 +17537,7 @@
     </w:p>
     <w:p>
       <w:pPr>
-        <w:pStyle w:val="Heading1"/>
+        <w:pStyle w:val="Ttulo1"/>
       </w:pPr>
       <w:r>
         <w:t xml:space="preserve">Referencias</w:t>
@@ -17662,7 +17851,7 @@
     </w:p>
     <w:p>
       <w:pPr>
-        <w:pStyle w:val="Heading1"/>
+        <w:pStyle w:val="Ttulo1"/>
         <w:pageBreakBefore/>
       </w:pPr>
       <w:r>
@@ -18274,7 +18463,7 @@
     </w:p>
     <w:p>
       <w:pPr>
-        <w:pStyle w:val="Heading1"/>
+        <w:pStyle w:val="Ttulo1"/>
         <w:pageBreakBefore/>
       </w:pPr>
       <w:r>
@@ -22927,7 +23116,7 @@
     </w:p>
     <w:p>
       <w:pPr>
-        <w:pStyle w:val="Heading1"/>
+        <w:pStyle w:val="Ttulo1"/>
         <w:pageBreakBefore/>
       </w:pPr>
       <w:r>
@@ -23076,10 +23265,10 @@
       </w:r>
     </w:p>
     <w:sectPr>
-      <w:headerReference w:type="default" r:id="rId6"/>
-      <w:pgSz w:w="12240" w:h="15840" w:orient="portrait"/>
+      <w:headerReference w:type="default" r:id="rId7"/>
+      <w:pgSz w:w="12240" w:h="15840"/>
       <w:pgMar w:top="1418" w:right="1418" w:bottom="1418" w:left="1418" w:header="567" w:footer="567" w:gutter="0"/>
-      <w:pgNumType/>
+      <w:cols w:space="708"/>
       <w:docGrid w:linePitch="360"/>
     </w:sectPr>
   </w:body>
@@ -23087,18 +23276,12 @@
 </file>
 
 <file path=word/endnotes.xml><?xml version="1.0" encoding="utf-8"?>
-<w:endnotes xmlns:wpc="http://schemas.microsoft.com/office/word/2010/wordprocessingCanvas" xmlns:mc="http://schemas.openxmlformats.org/markup-compatibility/2006" xmlns:o="urn:schemas-microsoft-com:office:office" xmlns:r="http://schemas.openxmlformats.org/officeDocument/2006/relationships" xmlns:m="http://schemas.openxmlformats.org/officeDocument/2006/math" xmlns:v="urn:schemas-microsoft-com:vml" xmlns:wp14="http://schemas.microsoft.com/office/word/2010/wordprocessingDrawing" xmlns:wp="http://schemas.openxmlformats.org/drawingml/2006/wordprocessingDrawing" xmlns:w10="urn:schemas-microsoft-com:office:word" xmlns:w="http://schemas.openxmlformats.org/wordprocessingml/2006/main" xmlns:w14="http://schemas.microsoft.com/office/word/2010/wordml" xmlns:w15="http://schemas.microsoft.com/office/word/2012/wordml" xmlns:wpg="http://schemas.microsoft.com/office/word/2010/wordprocessingGroup" xmlns:wpi="http://schemas.microsoft.com/office/word/2010/wordprocessingInk" xmlns:wne="http://schemas.microsoft.com/office/word/2006/wordml" xmlns:wps="http://schemas.microsoft.com/office/word/2010/wordprocessingShape" mc:Ignorable="w14 w15 wp14">
+<w:endnotes xmlns:wpc="http://schemas.microsoft.com/office/word/2010/wordprocessingCanvas" xmlns:cx="http://schemas.microsoft.com/office/drawing/2014/chartex" xmlns:cx1="http://schemas.microsoft.com/office/drawing/2015/9/8/chartex" xmlns:cx2="http://schemas.microsoft.com/office/drawing/2015/10/21/chartex" xmlns:cx3="http://schemas.microsoft.com/office/drawing/2016/5/9/chartex" xmlns:cx4="http://schemas.microsoft.com/office/drawing/2016/5/10/chartex" xmlns:cx5="http://schemas.microsoft.com/office/drawing/2016/5/11/chartex" xmlns:cx6="http://schemas.microsoft.com/office/drawing/2016/5/12/chartex" xmlns:cx7="http://schemas.microsoft.com/office/drawing/2016/5/13/chartex" xmlns:cx8="http://schemas.microsoft.com/office/drawing/2016/5/14/chartex" xmlns:mc="http://schemas.openxmlformats.org/markup-compatibility/2006" xmlns:aink="http://schemas.microsoft.com/office/drawing/2016/ink" xmlns:am3d="http://schemas.microsoft.com/office/drawing/2017/model3d" xmlns:o="urn:schemas-microsoft-com:office:office" xmlns:r="http://schemas.openxmlformats.org/officeDocument/2006/relationships" xmlns:m="http://schemas.openxmlformats.org/officeDocument/2006/math" xmlns:v="urn:schemas-microsoft-com:vml" xmlns:wp14="http://schemas.microsoft.com/office/word/2010/wordprocessingDrawing" xmlns:wp="http://schemas.openxmlformats.org/drawingml/2006/wordprocessingDrawing" xmlns:w10="urn:schemas-microsoft-com:office:word" xmlns:w="http://schemas.openxmlformats.org/wordprocessingml/2006/main" xmlns:w14="http://schemas.microsoft.com/office/word/2010/wordml" xmlns:w15="http://schemas.microsoft.com/office/word/2012/wordml" xmlns:w16cex="http://schemas.microsoft.com/office/word/2018/wordml/cex" xmlns:w16cid="http://schemas.microsoft.com/office/word/2016/wordml/cid" xmlns:w16="http://schemas.microsoft.com/office/word/2018/wordml" xmlns:w16sdtdh="http://schemas.microsoft.com/office/word/2020/wordml/sdtdatahash" xmlns:w16se="http://schemas.microsoft.com/office/word/2015/wordml/symex" xmlns:wpg="http://schemas.microsoft.com/office/word/2010/wordprocessingGroup" xmlns:wpi="http://schemas.microsoft.com/office/word/2010/wordprocessingInk" xmlns:wne="http://schemas.microsoft.com/office/word/2006/wordml" xmlns:wps="http://schemas.microsoft.com/office/word/2010/wordprocessingShape" mc:Ignorable="w14 w15 w16se w16cid w16 w16cex w16sdtdh wp14">
   <w:endnote w:type="separator" w:id="-1">
     <w:p>
       <w:pPr>
         <w:spacing w:after="0" w:line="240" w:lineRule="auto"/>
       </w:pPr>
-      <w:r>
-        <w:rPr>
-          <w:rStyle w:val="EndnoteReference"/>
-        </w:rPr>
-        <w:endnoteRef/>
-      </w:r>
       <w:r>
         <w:separator/>
       </w:r>
@@ -23110,12 +23293,6 @@
         <w:spacing w:after="0" w:line="240" w:lineRule="auto"/>
       </w:pPr>
       <w:r>
-        <w:rPr>
-          <w:rStyle w:val="EndnoteReference"/>
-        </w:rPr>
-        <w:endnoteRef/>
-      </w:r>
-      <w:r>
         <w:continuationSeparator/>
       </w:r>
     </w:p>
@@ -23124,18 +23301,12 @@
 </file>
 
 <file path=word/footnotes.xml><?xml version="1.0" encoding="utf-8"?>
-<w:footnotes xmlns:wpc="http://schemas.microsoft.com/office/word/2010/wordprocessingCanvas" xmlns:mc="http://schemas.openxmlformats.org/markup-compatibility/2006" xmlns:o="urn:schemas-microsoft-com:office:office" xmlns:r="http://schemas.openxmlformats.org/officeDocument/2006/relationships" xmlns:m="http://schemas.openxmlformats.org/officeDocument/2006/math" xmlns:v="urn:schemas-microsoft-com:vml" xmlns:wp14="http://schemas.microsoft.com/office/word/2010/wordprocessingDrawing" xmlns:wp="http://schemas.openxmlformats.org/drawingml/2006/wordprocessingDrawing" xmlns:w10="urn:schemas-microsoft-com:office:word" xmlns:w="http://schemas.openxmlformats.org/wordprocessingml/2006/main" xmlns:w14="http://schemas.microsoft.com/office/word/2010/wordml" xmlns:w15="http://schemas.microsoft.com/office/word/2012/wordml" xmlns:wpg="http://schemas.microsoft.com/office/word/2010/wordprocessingGroup" xmlns:wpi="http://schemas.microsoft.com/office/word/2010/wordprocessingInk" xmlns:wne="http://schemas.microsoft.com/office/word/2006/wordml" xmlns:wps="http://schemas.microsoft.com/office/word/2010/wordprocessingShape" mc:Ignorable="w14 w15 wp14">
+<w:footnotes xmlns:wpc="http://schemas.microsoft.com/office/word/2010/wordprocessingCanvas" xmlns:cx="http://schemas.microsoft.com/office/drawing/2014/chartex" xmlns:cx1="http://schemas.microsoft.com/office/drawing/2015/9/8/chartex" xmlns:cx2="http://schemas.microsoft.com/office/drawing/2015/10/21/chartex" xmlns:cx3="http://schemas.microsoft.com/office/drawing/2016/5/9/chartex" xmlns:cx4="http://schemas.microsoft.com/office/drawing/2016/5/10/chartex" xmlns:cx5="http://schemas.microsoft.com/office/drawing/2016/5/11/chartex" xmlns:cx6="http://schemas.microsoft.com/office/drawing/2016/5/12/chartex" xmlns:cx7="http://schemas.microsoft.com/office/drawing/2016/5/13/chartex" xmlns:cx8="http://schemas.microsoft.com/office/drawing/2016/5/14/chartex" xmlns:mc="http://schemas.openxmlformats.org/markup-compatibility/2006" xmlns:aink="http://schemas.microsoft.com/office/drawing/2016/ink" xmlns:am3d="http://schemas.microsoft.com/office/drawing/2017/model3d" xmlns:o="urn:schemas-microsoft-com:office:office" xmlns:r="http://schemas.openxmlformats.org/officeDocument/2006/relationships" xmlns:m="http://schemas.openxmlformats.org/officeDocument/2006/math" xmlns:v="urn:schemas-microsoft-com:vml" xmlns:wp14="http://schemas.microsoft.com/office/word/2010/wordprocessingDrawing" xmlns:wp="http://schemas.openxmlformats.org/drawingml/2006/wordprocessingDrawing" xmlns:w10="urn:schemas-microsoft-com:office:word" xmlns:w="http://schemas.openxmlformats.org/wordprocessingml/2006/main" xmlns:w14="http://schemas.microsoft.com/office/word/2010/wordml" xmlns:w15="http://schemas.microsoft.com/office/word/2012/wordml" xmlns:w16cex="http://schemas.microsoft.com/office/word/2018/wordml/cex" xmlns:w16cid="http://schemas.microsoft.com/office/word/2016/wordml/cid" xmlns:w16="http://schemas.microsoft.com/office/word/2018/wordml" xmlns:w16sdtdh="http://schemas.microsoft.com/office/word/2020/wordml/sdtdatahash" xmlns:w16se="http://schemas.microsoft.com/office/word/2015/wordml/symex" xmlns:wpg="http://schemas.microsoft.com/office/word/2010/wordprocessingGroup" xmlns:wpi="http://schemas.microsoft.com/office/word/2010/wordprocessingInk" xmlns:wne="http://schemas.microsoft.com/office/word/2006/wordml" xmlns:wps="http://schemas.microsoft.com/office/word/2010/wordprocessingShape" mc:Ignorable="w14 w15 w16se w16cid w16 w16cex w16sdtdh wp14">
   <w:footnote w:type="separator" w:id="-1">
     <w:p>
       <w:pPr>
         <w:spacing w:after="0" w:line="240" w:lineRule="auto"/>
       </w:pPr>
-      <w:r>
-        <w:rPr>
-          <w:rStyle w:val="FootnoteReference"/>
-        </w:rPr>
-        <w:footnoteRef/>
-      </w:r>
       <w:r>
         <w:separator/>
       </w:r>
@@ -23147,12 +23318,6 @@
         <w:spacing w:after="0" w:line="240" w:lineRule="auto"/>
       </w:pPr>
       <w:r>
-        <w:rPr>
-          <w:rStyle w:val="FootnoteReference"/>
-        </w:rPr>
-        <w:footnoteRef/>
-      </w:r>
-      <w:r>
         <w:continuationSeparator/>
       </w:r>
     </w:p>
@@ -23161,448 +23326,467 @@
 </file>
 
 <file path=word/header1.xml><?xml version="1.0" encoding="utf-8"?>
-<w:hdr xmlns:wpc="http://schemas.microsoft.com/office/word/2010/wordprocessingCanvas" xmlns:mc="http://schemas.openxmlformats.org/markup-compatibility/2006" xmlns:o="urn:schemas-microsoft-com:office:office" xmlns:r="http://schemas.openxmlformats.org/officeDocument/2006/relationships" xmlns:m="http://schemas.openxmlformats.org/officeDocument/2006/math" xmlns:v="urn:schemas-microsoft-com:vml" xmlns:wp14="http://schemas.microsoft.com/office/word/2010/wordprocessingDrawing" xmlns:wp="http://schemas.openxmlformats.org/drawingml/2006/wordprocessingDrawing" xmlns:w10="urn:schemas-microsoft-com:office:word" xmlns:w="http://schemas.openxmlformats.org/wordprocessingml/2006/main" xmlns:w14="http://schemas.microsoft.com/office/word/2010/wordml" xmlns:w15="http://schemas.microsoft.com/office/word/2012/wordml" xmlns:wpg="http://schemas.microsoft.com/office/word/2010/wordprocessingGroup" xmlns:wpi="http://schemas.microsoft.com/office/word/2010/wordprocessingInk" xmlns:wne="http://schemas.microsoft.com/office/word/2006/wordml" xmlns:wps="http://schemas.microsoft.com/office/word/2010/wordprocessingShape" xmlns:cx="http://schemas.microsoft.com/office/drawing/2014/chartex" xmlns:cx1="http://schemas.microsoft.com/office/drawing/2015/9/8/chartex" xmlns:cx2="http://schemas.microsoft.com/office/drawing/2015/10/21/chartex" xmlns:cx3="http://schemas.microsoft.com/office/drawing/2016/5/9/chartex" xmlns:cx4="http://schemas.microsoft.com/office/drawing/2016/5/10/chartex" xmlns:cx5="http://schemas.microsoft.com/office/drawing/2016/5/11/chartex" xmlns:cx6="http://schemas.microsoft.com/office/drawing/2016/5/12/chartex" xmlns:cx7="http://schemas.microsoft.com/office/drawing/2016/5/13/chartex" xmlns:cx8="http://schemas.microsoft.com/office/drawing/2016/5/14/chartex" xmlns:w16cid="http://schemas.microsoft.com/office/word/2016/wordml/cid" xmlns:w16se="http://schemas.microsoft.com/office/word/2015/wordml/symex">
+<w:hdr xmlns:wpc="http://schemas.microsoft.com/office/word/2010/wordprocessingCanvas" xmlns:cx="http://schemas.microsoft.com/office/drawing/2014/chartex" xmlns:cx1="http://schemas.microsoft.com/office/drawing/2015/9/8/chartex" xmlns:cx2="http://schemas.microsoft.com/office/drawing/2015/10/21/chartex" xmlns:cx3="http://schemas.microsoft.com/office/drawing/2016/5/9/chartex" xmlns:cx4="http://schemas.microsoft.com/office/drawing/2016/5/10/chartex" xmlns:cx5="http://schemas.microsoft.com/office/drawing/2016/5/11/chartex" xmlns:cx6="http://schemas.microsoft.com/office/drawing/2016/5/12/chartex" xmlns:cx7="http://schemas.microsoft.com/office/drawing/2016/5/13/chartex" xmlns:cx8="http://schemas.microsoft.com/office/drawing/2016/5/14/chartex" xmlns:mc="http://schemas.openxmlformats.org/markup-compatibility/2006" xmlns:aink="http://schemas.microsoft.com/office/drawing/2016/ink" xmlns:am3d="http://schemas.microsoft.com/office/drawing/2017/model3d" xmlns:o="urn:schemas-microsoft-com:office:office" xmlns:r="http://schemas.openxmlformats.org/officeDocument/2006/relationships" xmlns:m="http://schemas.openxmlformats.org/officeDocument/2006/math" xmlns:v="urn:schemas-microsoft-com:vml" xmlns:wp14="http://schemas.microsoft.com/office/word/2010/wordprocessingDrawing" xmlns:wp="http://schemas.openxmlformats.org/drawingml/2006/wordprocessingDrawing" xmlns:w10="urn:schemas-microsoft-com:office:word" xmlns:w="http://schemas.openxmlformats.org/wordprocessingml/2006/main" xmlns:w14="http://schemas.microsoft.com/office/word/2010/wordml" xmlns:w15="http://schemas.microsoft.com/office/word/2012/wordml" xmlns:w16cex="http://schemas.microsoft.com/office/word/2018/wordml/cex" xmlns:w16cid="http://schemas.microsoft.com/office/word/2016/wordml/cid" xmlns:w16="http://schemas.microsoft.com/office/word/2018/wordml" xmlns:w16sdtdh="http://schemas.microsoft.com/office/word/2020/wordml/sdtdatahash" xmlns:w16se="http://schemas.microsoft.com/office/word/2015/wordml/symex" xmlns:wpg="http://schemas.microsoft.com/office/word/2010/wordprocessingGroup" xmlns:wpi="http://schemas.microsoft.com/office/word/2010/wordprocessingInk" xmlns:wne="http://schemas.microsoft.com/office/word/2006/wordml" xmlns:wps="http://schemas.microsoft.com/office/word/2010/wordprocessingShape" mc:Ignorable="w14 w15 w16se w16cid w16 w16cex w16sdtdh wp14">
+  <w:sdt>
+    <w:sdtPr>
+      <w:id w:val="1956132887"/>
+      <w:docPartObj>
+        <w:docPartGallery w:val="Page Numbers (Top of Page)"/>
+        <w:docPartUnique/>
+      </w:docPartObj>
+    </w:sdtPr>
+    <w:sdtEndPr/>
+    <w:sdtContent>
+      <w:p>
+        <w:pPr>
+          <w:pStyle w:val="Encabezado"/>
+          <w:jc w:val="right"/>
+        </w:pPr>
+        <w:r>
+          <w:fldChar w:fldCharType="begin"/>
+        </w:r>
+        <w:r>
+          <w:instrText>PAGE   \* MERGEFORMAT</w:instrText>
+        </w:r>
+        <w:r>
+          <w:fldChar w:fldCharType="separate"/>
+        </w:r>
+        <w:r>
+          <w:rPr>
+            <w:lang w:val="es-MX"/>
+          </w:rPr>
+          <w:t>2</w:t>
+        </w:r>
+        <w:r>
+          <w:fldChar w:fldCharType="end"/>
+        </w:r>
+      </w:p>
+    </w:sdtContent>
+  </w:sdt>
   <w:p>
     <w:pPr>
-      <w:jc w:val="right"/>
+      <w:pStyle w:val="Encabezado"/>
     </w:pPr>
-    <w:r>
-      <w:fldChar w:fldCharType="begin"/>
-    </w:r>
-    <w:r>
-      <w:instrText xml:space="preserve">PAGE</w:instrText>
-    </w:r>
-    <w:r>
-      <w:fldChar w:fldCharType="separate"/>
-    </w:r>
-    <w:r>
-      <w:fldChar w:fldCharType="end"/>
-    </w:r>
   </w:p>
 </w:hdr>
 </file>
 
-<file path=word/numbering.xml><?xml version="1.0" encoding="utf-8"?>
-<w:numbering xmlns:wpc="http://schemas.microsoft.com/office/word/2010/wordprocessingCanvas" xmlns:mc="http://schemas.openxmlformats.org/markup-compatibility/2006" xmlns:o="urn:schemas-microsoft-com:office:office" xmlns:r="http://schemas.openxmlformats.org/officeDocument/2006/relationships" xmlns:m="http://schemas.openxmlformats.org/officeDocument/2006/math" xmlns:v="urn:schemas-microsoft-com:vml" xmlns:wp14="http://schemas.microsoft.com/office/word/2010/wordprocessingDrawing" xmlns:wp="http://schemas.openxmlformats.org/drawingml/2006/wordprocessingDrawing" xmlns:w10="urn:schemas-microsoft-com:office:word" xmlns:w="http://schemas.openxmlformats.org/wordprocessingml/2006/main" xmlns:w14="http://schemas.microsoft.com/office/word/2010/wordml" xmlns:w15="http://schemas.microsoft.com/office/word/2012/wordml" xmlns:wpg="http://schemas.microsoft.com/office/word/2010/wordprocessingGroup" xmlns:wpi="http://schemas.microsoft.com/office/word/2010/wordprocessingInk" xmlns:wne="http://schemas.microsoft.com/office/word/2006/wordml" xmlns:wps="http://schemas.microsoft.com/office/word/2010/wordprocessingShape" mc:Ignorable="w14 w15 wp14">
-  <w:abstractNum w:abstractNumId="1" w15:restartNumberingAfterBreak="0">
-    <w:multiLevelType w:val="hybridMultilevel"/>
-    <w:lvl w:ilvl="0" w:tentative="1">
-      <w:start w:val="1"/>
-      <w:numFmt w:val="bullet"/>
-      <w:lvlText w:val="●"/>
-      <w:lvlJc w:val="left"/>
-      <w:pPr>
-        <w:ind w:left="720" w:hanging="360"/>
-      </w:pPr>
-    </w:lvl>
-    <w:lvl w:ilvl="1" w:tentative="1">
-      <w:start w:val="1"/>
-      <w:numFmt w:val="bullet"/>
-      <w:lvlText w:val="○"/>
-      <w:lvlJc w:val="left"/>
-      <w:pPr>
-        <w:ind w:left="1440" w:hanging="360"/>
-      </w:pPr>
-    </w:lvl>
-    <w:lvl w:ilvl="2" w:tentative="1">
-      <w:start w:val="1"/>
-      <w:numFmt w:val="bullet"/>
-      <w:lvlText w:val="■"/>
-      <w:lvlJc w:val="left"/>
-      <w:pPr>
-        <w:ind w:left="2160" w:hanging="360"/>
-      </w:pPr>
-    </w:lvl>
-    <w:lvl w:ilvl="3" w:tentative="1">
-      <w:start w:val="1"/>
-      <w:numFmt w:val="bullet"/>
-      <w:lvlText w:val="●"/>
-      <w:lvlJc w:val="left"/>
-      <w:pPr>
-        <w:ind w:left="2880" w:hanging="360"/>
-      </w:pPr>
-    </w:lvl>
-    <w:lvl w:ilvl="4" w:tentative="1">
-      <w:start w:val="1"/>
-      <w:numFmt w:val="bullet"/>
-      <w:lvlText w:val="○"/>
-      <w:lvlJc w:val="left"/>
-      <w:pPr>
-        <w:ind w:left="3600" w:hanging="360"/>
-      </w:pPr>
-    </w:lvl>
-    <w:lvl w:ilvl="5" w:tentative="1">
-      <w:start w:val="1"/>
-      <w:numFmt w:val="bullet"/>
-      <w:lvlText w:val="■"/>
-      <w:lvlJc w:val="left"/>
-      <w:pPr>
-        <w:ind w:left="4320" w:hanging="360"/>
-      </w:pPr>
-    </w:lvl>
-    <w:lvl w:ilvl="6" w:tentative="1">
-      <w:start w:val="1"/>
-      <w:numFmt w:val="bullet"/>
-      <w:lvlText w:val="●"/>
-      <w:lvlJc w:val="left"/>
-      <w:pPr>
-        <w:ind w:left="5040" w:hanging="360"/>
-      </w:pPr>
-    </w:lvl>
-    <w:lvl w:ilvl="7" w:tentative="1">
-      <w:start w:val="1"/>
-      <w:numFmt w:val="bullet"/>
-      <w:lvlText w:val="●"/>
-      <w:lvlJc w:val="left"/>
-      <w:pPr>
-        <w:ind w:left="5760" w:hanging="360"/>
-      </w:pPr>
-    </w:lvl>
-    <w:lvl w:ilvl="8" w:tentative="1">
-      <w:start w:val="1"/>
-      <w:numFmt w:val="bullet"/>
-      <w:lvlText w:val="●"/>
-      <w:lvlJc w:val="left"/>
-      <w:pPr>
-        <w:ind w:left="6480" w:hanging="360"/>
-      </w:pPr>
-    </w:lvl>
-  </w:abstractNum>
-  <w:num w:numId="1">
-    <w:abstractNumId w:val="1"/>
-    <w:lvlOverride w:ilvl="0">
-      <w:startOverride w:val="1"/>
-    </w:lvlOverride>
-  </w:num>
-</w:numbering>
-</file>
-
 <file path=word/styles.xml><?xml version="1.0" encoding="utf-8"?>
-<w:styles xmlns:mc="http://schemas.openxmlformats.org/markup-compatibility/2006" xmlns:r="http://schemas.openxmlformats.org/officeDocument/2006/relationships" xmlns:w="http://schemas.openxmlformats.org/wordprocessingml/2006/main" xmlns:w14="http://schemas.microsoft.com/office/word/2010/wordml" xmlns:w15="http://schemas.microsoft.com/office/word/2012/wordml" mc:Ignorable="w14 w15">
+<w:styles xmlns:mc="http://schemas.openxmlformats.org/markup-compatibility/2006" xmlns:r="http://schemas.openxmlformats.org/officeDocument/2006/relationships" xmlns:w="http://schemas.openxmlformats.org/wordprocessingml/2006/main" xmlns:w14="http://schemas.microsoft.com/office/word/2010/wordml" xmlns:w15="http://schemas.microsoft.com/office/word/2012/wordml" xmlns:w16cex="http://schemas.microsoft.com/office/word/2018/wordml/cex" xmlns:w16cid="http://schemas.microsoft.com/office/word/2016/wordml/cid" xmlns:w16="http://schemas.microsoft.com/office/word/2018/wordml" xmlns:w16sdtdh="http://schemas.microsoft.com/office/word/2020/wordml/sdtdatahash" xmlns:w16se="http://schemas.microsoft.com/office/word/2015/wordml/symex" mc:Ignorable="w14 w15 w16se w16cid w16 w16cex w16sdtdh">
   <w:docDefaults>
     <w:rPrDefault>
       <w:rPr>
-        <w:rFonts w:ascii="Times New Roman" w:cs="Times New Roman" w:eastAsia="Times New Roman" w:hAnsi="Times New Roman"/>
+        <w:rFonts w:ascii="Times New Roman" w:eastAsia="Times New Roman" w:hAnsi="Times New Roman" w:cs="Times New Roman"/>
         <w:sz w:val="24"/>
         <w:szCs w:val="24"/>
+        <w:lang w:val="es-CO" w:eastAsia="en-US" w:bidi="ar-SA"/>
       </w:rPr>
     </w:rPrDefault>
     <w:pPrDefault>
       <w:pPr>
-        <w:spacing w:after="0" w:line="480"/>
+        <w:spacing w:after="0" w:line="480" w:lineRule="auto"/>
       </w:pPr>
     </w:pPrDefault>
   </w:docDefaults>
-  <w:style w:type="paragraph" w:styleId="Normal" w:default="1">
+  <w:latentStyles w:defLockedState="0" w:defUIPriority="99" w:defSemiHidden="0" w:defUnhideWhenUsed="0" w:defQFormat="0" w:count="376">
+    <w:lsdException w:name="Normal" w:uiPriority="0" w:qFormat="1"/>
+    <w:lsdException w:name="heading 1" w:uiPriority="9" w:qFormat="1"/>
+    <w:lsdException w:name="heading 2" w:semiHidden="1" w:uiPriority="9" w:unhideWhenUsed="1" w:qFormat="1"/>
+    <w:lsdException w:name="heading 3" w:semiHidden="1" w:uiPriority="9" w:unhideWhenUsed="1" w:qFormat="1"/>
+    <w:lsdException w:name="heading 4" w:semiHidden="1" w:uiPriority="9" w:unhideWhenUsed="1" w:qFormat="1"/>
+    <w:lsdException w:name="heading 5" w:semiHidden="1" w:uiPriority="9" w:unhideWhenUsed="1" w:qFormat="1"/>
+    <w:lsdException w:name="heading 6" w:semiHidden="1" w:uiPriority="9" w:unhideWhenUsed="1" w:qFormat="1"/>
+    <w:lsdException w:name="heading 7" w:semiHidden="1" w:uiPriority="9" w:unhideWhenUsed="1" w:qFormat="1"/>
+    <w:lsdException w:name="heading 8" w:semiHidden="1" w:uiPriority="9" w:unhideWhenUsed="1" w:qFormat="1"/>
+    <w:lsdException w:name="heading 9" w:semiHidden="1" w:uiPriority="9" w:unhideWhenUsed="1" w:qFormat="1"/>
+    <w:lsdException w:name="index 1" w:semiHidden="1" w:unhideWhenUsed="1"/>
+    <w:lsdException w:name="index 2" w:semiHidden="1" w:unhideWhenUsed="1"/>
+    <w:lsdException w:name="index 3" w:semiHidden="1" w:unhideWhenUsed="1"/>
+    <w:lsdException w:name="index 4" w:semiHidden="1" w:unhideWhenUsed="1"/>
+    <w:lsdException w:name="index 5" w:semiHidden="1" w:unhideWhenUsed="1"/>
+    <w:lsdException w:name="index 6" w:semiHidden="1" w:unhideWhenUsed="1"/>
+    <w:lsdException w:name="index 7" w:semiHidden="1" w:unhideWhenUsed="1"/>
+    <w:lsdException w:name="index 8" w:semiHidden="1" w:unhideWhenUsed="1"/>
+    <w:lsdException w:name="index 9" w:semiHidden="1" w:unhideWhenUsed="1"/>
+    <w:lsdException w:name="toc 1" w:semiHidden="1" w:uiPriority="39" w:unhideWhenUsed="1"/>
+    <w:lsdException w:name="toc 2" w:semiHidden="1" w:uiPriority="39" w:unhideWhenUsed="1"/>
+    <w:lsdException w:name="toc 3" w:semiHidden="1" w:uiPriority="39" w:unhideWhenUsed="1"/>
+    <w:lsdException w:name="toc 4" w:semiHidden="1" w:uiPriority="39" w:unhideWhenUsed="1"/>
+    <w:lsdException w:name="toc 5" w:semiHidden="1" w:uiPriority="39" w:unhideWhenUsed="1"/>
+    <w:lsdException w:name="toc 6" w:semiHidden="1" w:uiPriority="39" w:unhideWhenUsed="1"/>
+    <w:lsdException w:name="toc 7" w:semiHidden="1" w:uiPriority="39" w:unhideWhenUsed="1"/>
+    <w:lsdException w:name="toc 8" w:semiHidden="1" w:uiPriority="39" w:unhideWhenUsed="1"/>
+    <w:lsdException w:name="toc 9" w:semiHidden="1" w:uiPriority="39" w:unhideWhenUsed="1"/>
+    <w:lsdException w:name="Normal Indent" w:semiHidden="1" w:unhideWhenUsed="1"/>
+    <w:lsdException w:name="footnote text" w:semiHidden="1" w:unhideWhenUsed="1"/>
+    <w:lsdException w:name="annotation text" w:semiHidden="1" w:unhideWhenUsed="1"/>
+    <w:lsdException w:name="header" w:semiHidden="1" w:unhideWhenUsed="1"/>
+    <w:lsdException w:name="footer" w:semiHidden="1" w:unhideWhenUsed="1"/>
+    <w:lsdException w:name="index heading" w:semiHidden="1" w:unhideWhenUsed="1"/>
+    <w:lsdException w:name="caption" w:semiHidden="1" w:uiPriority="35" w:unhideWhenUsed="1" w:qFormat="1"/>
+    <w:lsdException w:name="table of figures" w:semiHidden="1" w:unhideWhenUsed="1"/>
+    <w:lsdException w:name="envelope address" w:semiHidden="1" w:unhideWhenUsed="1"/>
+    <w:lsdException w:name="envelope return" w:semiHidden="1" w:unhideWhenUsed="1"/>
+    <w:lsdException w:name="footnote reference" w:semiHidden="1" w:unhideWhenUsed="1"/>
+    <w:lsdException w:name="annotation reference" w:semiHidden="1" w:unhideWhenUsed="1"/>
+    <w:lsdException w:name="line number" w:semiHidden="1" w:unhideWhenUsed="1"/>
+    <w:lsdException w:name="page number" w:semiHidden="1" w:unhideWhenUsed="1"/>
+    <w:lsdException w:name="endnote reference" w:semiHidden="1" w:unhideWhenUsed="1"/>
+    <w:lsdException w:name="endnote text" w:semiHidden="1" w:unhideWhenUsed="1"/>
+    <w:lsdException w:name="table of authorities" w:semiHidden="1" w:unhideWhenUsed="1"/>
+    <w:lsdException w:name="macro" w:semiHidden="1" w:unhideWhenUsed="1"/>
+    <w:lsdException w:name="toa heading" w:semiHidden="1" w:unhideWhenUsed="1"/>
+    <w:lsdException w:name="List" w:semiHidden="1" w:unhideWhenUsed="1"/>
+    <w:lsdException w:name="List Bullet" w:semiHidden="1" w:unhideWhenUsed="1"/>
+    <w:lsdException w:name="List Number" w:semiHidden="1" w:unhideWhenUsed="1"/>
+    <w:lsdException w:name="List 2" w:semiHidden="1" w:unhideWhenUsed="1"/>
+    <w:lsdException w:name="List 3" w:semiHidden="1" w:unhideWhenUsed="1"/>
+    <w:lsdException w:name="List 4" w:semiHidden="1" w:unhideWhenUsed="1"/>
+    <w:lsdException w:name="List 5" w:semiHidden="1" w:unhideWhenUsed="1"/>
+    <w:lsdException w:name="List Bullet 2" w:semiHidden="1" w:unhideWhenUsed="1"/>
+    <w:lsdException w:name="List Bullet 3" w:semiHidden="1" w:unhideWhenUsed="1"/>
+    <w:lsdException w:name="List Bullet 4" w:semiHidden="1" w:unhideWhenUsed="1"/>
+    <w:lsdException w:name="List Bullet 5" w:semiHidden="1" w:unhideWhenUsed="1"/>
+    <w:lsdException w:name="List Number 2" w:semiHidden="1" w:unhideWhenUsed="1"/>
+    <w:lsdException w:name="List Number 3" w:semiHidden="1" w:unhideWhenUsed="1"/>
+    <w:lsdException w:name="List Number 4" w:semiHidden="1" w:unhideWhenUsed="1"/>
+    <w:lsdException w:name="List Number 5" w:semiHidden="1" w:unhideWhenUsed="1"/>
+    <w:lsdException w:name="Title" w:uiPriority="10" w:qFormat="1"/>
+    <w:lsdException w:name="Closing" w:semiHidden="1" w:unhideWhenUsed="1"/>
+    <w:lsdException w:name="Signature" w:semiHidden="1" w:unhideWhenUsed="1"/>
+    <w:lsdException w:name="Default Paragraph Font" w:semiHidden="1" w:uiPriority="1" w:unhideWhenUsed="1"/>
+    <w:lsdException w:name="Body Text" w:semiHidden="1" w:unhideWhenUsed="1"/>
+    <w:lsdException w:name="Body Text Indent" w:semiHidden="1" w:unhideWhenUsed="1"/>
+    <w:lsdException w:name="List Continue" w:semiHidden="1" w:unhideWhenUsed="1"/>
+    <w:lsdException w:name="List Continue 2" w:semiHidden="1" w:unhideWhenUsed="1"/>
+    <w:lsdException w:name="List Continue 3" w:semiHidden="1" w:unhideWhenUsed="1"/>
+    <w:lsdException w:name="List Continue 4" w:semiHidden="1" w:unhideWhenUsed="1"/>
+    <w:lsdException w:name="List Continue 5" w:semiHidden="1" w:unhideWhenUsed="1"/>
+    <w:lsdException w:name="Message Header" w:semiHidden="1" w:unhideWhenUsed="1"/>
+    <w:lsdException w:name="Subtitle" w:uiPriority="11" w:qFormat="1"/>
+    <w:lsdException w:name="Salutation" w:semiHidden="1" w:unhideWhenUsed="1"/>
+    <w:lsdException w:name="Date" w:semiHidden="1" w:unhideWhenUsed="1"/>
+    <w:lsdException w:name="Body Text First Indent" w:semiHidden="1" w:unhideWhenUsed="1"/>
+    <w:lsdException w:name="Body Text First Indent 2" w:semiHidden="1" w:unhideWhenUsed="1"/>
+    <w:lsdException w:name="Note Heading" w:semiHidden="1" w:unhideWhenUsed="1"/>
+    <w:lsdException w:name="Body Text 2" w:semiHidden="1" w:unhideWhenUsed="1"/>
+    <w:lsdException w:name="Body Text 3" w:semiHidden="1" w:unhideWhenUsed="1"/>
+    <w:lsdException w:name="Body Text Indent 2" w:semiHidden="1" w:unhideWhenUsed="1"/>
+    <w:lsdException w:name="Body Text Indent 3" w:semiHidden="1" w:unhideWhenUsed="1"/>
+    <w:lsdException w:name="Block Text" w:semiHidden="1" w:unhideWhenUsed="1"/>
+    <w:lsdException w:name="Hyperlink" w:semiHidden="1" w:unhideWhenUsed="1"/>
+    <w:lsdException w:name="FollowedHyperlink" w:semiHidden="1" w:unhideWhenUsed="1"/>
+    <w:lsdException w:name="Strong" w:uiPriority="22" w:qFormat="1"/>
+    <w:lsdException w:name="Emphasis" w:uiPriority="20" w:qFormat="1"/>
+    <w:lsdException w:name="Document Map" w:semiHidden="1" w:unhideWhenUsed="1"/>
+    <w:lsdException w:name="Plain Text" w:semiHidden="1" w:unhideWhenUsed="1"/>
+    <w:lsdException w:name="E-mail Signature" w:semiHidden="1" w:unhideWhenUsed="1"/>
+    <w:lsdException w:name="HTML Top of Form" w:semiHidden="1" w:unhideWhenUsed="1"/>
+    <w:lsdException w:name="HTML Bottom of Form" w:semiHidden="1" w:unhideWhenUsed="1"/>
+    <w:lsdException w:name="Normal (Web)" w:semiHidden="1" w:unhideWhenUsed="1"/>
+    <w:lsdException w:name="HTML Acronym" w:semiHidden="1" w:unhideWhenUsed="1"/>
+    <w:lsdException w:name="HTML Address" w:semiHidden="1" w:unhideWhenUsed="1"/>
+    <w:lsdException w:name="HTML Cite" w:semiHidden="1" w:unhideWhenUsed="1"/>
+    <w:lsdException w:name="HTML Code" w:semiHidden="1" w:unhideWhenUsed="1"/>
+    <w:lsdException w:name="HTML Definition" w:semiHidden="1" w:unhideWhenUsed="1"/>
+    <w:lsdException w:name="HTML Keyboard" w:semiHidden="1" w:unhideWhenUsed="1"/>
+    <w:lsdException w:name="HTML Preformatted" w:semiHidden="1" w:unhideWhenUsed="1"/>
+    <w:lsdException w:name="HTML Sample" w:semiHidden="1" w:unhideWhenUsed="1"/>
+    <w:lsdException w:name="HTML Typewriter" w:semiHidden="1" w:unhideWhenUsed="1"/>
+    <w:lsdException w:name="HTML Variable" w:semiHidden="1" w:unhideWhenUsed="1"/>
+    <w:lsdException w:name="Normal Table" w:semiHidden="1" w:unhideWhenUsed="1"/>
+    <w:lsdException w:name="annotation subject" w:semiHidden="1" w:unhideWhenUsed="1"/>
+    <w:lsdException w:name="No List" w:semiHidden="1" w:unhideWhenUsed="1"/>
+    <w:lsdException w:name="Outline List 1" w:semiHidden="1" w:unhideWhenUsed="1"/>
+    <w:lsdException w:name="Outline List 2" w:semiHidden="1" w:unhideWhenUsed="1"/>
+    <w:lsdException w:name="Outline List 3" w:semiHidden="1" w:unhideWhenUsed="1"/>
+    <w:lsdException w:name="Table Simple 1" w:semiHidden="1" w:unhideWhenUsed="1"/>
+    <w:lsdException w:name="Table Simple 2" w:semiHidden="1" w:unhideWhenUsed="1"/>
+    <w:lsdException w:name="Table Simple 3" w:semiHidden="1" w:unhideWhenUsed="1"/>
+    <w:lsdException w:name="Table Classic 1" w:semiHidden="1" w:unhideWhenUsed="1"/>
+    <w:lsdException w:name="Table Classic 2" w:semiHidden="1" w:unhideWhenUsed="1"/>
+    <w:lsdException w:name="Table Classic 3" w:semiHidden="1" w:unhideWhenUsed="1"/>
+    <w:lsdException w:name="Table Classic 4" w:semiHidden="1" w:unhideWhenUsed="1"/>
+    <w:lsdException w:name="Table Colorful 1" w:semiHidden="1" w:unhideWhenUsed="1"/>
+    <w:lsdException w:name="Table Colorful 2" w:semiHidden="1" w:unhideWhenUsed="1"/>
+    <w:lsdException w:name="Table Colorful 3" w:semiHidden="1" w:unhideWhenUsed="1"/>
+    <w:lsdException w:name="Table Columns 1" w:semiHidden="1" w:unhideWhenUsed="1"/>
+    <w:lsdException w:name="Table Columns 2" w:semiHidden="1" w:unhideWhenUsed="1"/>
+    <w:lsdException w:name="Table Columns 3" w:semiHidden="1" w:unhideWhenUsed="1"/>
+    <w:lsdException w:name="Table Columns 4" w:semiHidden="1" w:unhideWhenUsed="1"/>
+    <w:lsdException w:name="Table Columns 5" w:semiHidden="1" w:unhideWhenUsed="1"/>
+    <w:lsdException w:name="Table Grid 1" w:semiHidden="1" w:unhideWhenUsed="1"/>
+    <w:lsdException w:name="Table Grid 2" w:semiHidden="1" w:unhideWhenUsed="1"/>
+    <w:lsdException w:name="Table Grid 3" w:semiHidden="1" w:unhideWhenUsed="1"/>
+    <w:lsdException w:name="Table Grid 4" w:semiHidden="1" w:unhideWhenUsed="1"/>
+    <w:lsdException w:name="Table Grid 5" w:semiHidden="1" w:unhideWhenUsed="1"/>
+    <w:lsdException w:name="Table Grid 6" w:semiHidden="1" w:unhideWhenUsed="1"/>
+    <w:lsdException w:name="Table Grid 7" w:semiHidden="1" w:unhideWhenUsed="1"/>
+    <w:lsdException w:name="Table Grid 8" w:semiHidden="1" w:unhideWhenUsed="1"/>
+    <w:lsdException w:name="Table List 1" w:semiHidden="1" w:unhideWhenUsed="1"/>
+    <w:lsdException w:name="Table List 2" w:semiHidden="1" w:unhideWhenUsed="1"/>
+    <w:lsdException w:name="Table List 3" w:semiHidden="1" w:unhideWhenUsed="1"/>
+    <w:lsdException w:name="Table List 4" w:semiHidden="1" w:unhideWhenUsed="1"/>
+    <w:lsdException w:name="Table List 5" w:semiHidden="1" w:unhideWhenUsed="1"/>
+    <w:lsdException w:name="Table List 6" w:semiHidden="1" w:unhideWhenUsed="1"/>
+    <w:lsdException w:name="Table List 7" w:semiHidden="1" w:unhideWhenUsed="1"/>
+    <w:lsdException w:name="Table List 8" w:semiHidden="1" w:unhideWhenUsed="1"/>
+    <w:lsdException w:name="Table 3D effects 1" w:semiHidden="1" w:unhideWhenUsed="1"/>
+    <w:lsdException w:name="Table 3D effects 2" w:semiHidden="1" w:unhideWhenUsed="1"/>
+    <w:lsdException w:name="Table 3D effects 3" w:semiHidden="1" w:unhideWhenUsed="1"/>
+    <w:lsdException w:name="Table Contemporary" w:semiHidden="1" w:unhideWhenUsed="1"/>
+    <w:lsdException w:name="Table Elegant" w:semiHidden="1" w:unhideWhenUsed="1"/>
+    <w:lsdException w:name="Table Professional" w:semiHidden="1" w:unhideWhenUsed="1"/>
+    <w:lsdException w:name="Table Subtle 1" w:semiHidden="1" w:unhideWhenUsed="1"/>
+    <w:lsdException w:name="Table Subtle 2" w:semiHidden="1" w:unhideWhenUsed="1"/>
+    <w:lsdException w:name="Table Web 1" w:semiHidden="1" w:unhideWhenUsed="1"/>
+    <w:lsdException w:name="Table Web 2" w:semiHidden="1" w:unhideWhenUsed="1"/>
+    <w:lsdException w:name="Table Web 3" w:semiHidden="1" w:unhideWhenUsed="1"/>
+    <w:lsdException w:name="Balloon Text" w:semiHidden="1" w:unhideWhenUsed="1"/>
+    <w:lsdException w:name="Table Grid" w:uiPriority="39"/>
+    <w:lsdException w:name="Table Theme" w:semiHidden="1" w:unhideWhenUsed="1"/>
+    <w:lsdException w:name="Placeholder Text" w:semiHidden="1"/>
+    <w:lsdException w:name="No Spacing" w:uiPriority="1" w:qFormat="1"/>
+    <w:lsdException w:name="Light Shading" w:uiPriority="60"/>
+    <w:lsdException w:name="Light List" w:uiPriority="61"/>
+    <w:lsdException w:name="Light Grid" w:uiPriority="62"/>
+    <w:lsdException w:name="Medium Shading 1" w:uiPriority="63"/>
+    <w:lsdException w:name="Medium Shading 2" w:uiPriority="64"/>
+    <w:lsdException w:name="Medium List 1" w:uiPriority="65"/>
+    <w:lsdException w:name="Medium List 2" w:uiPriority="66"/>
+    <w:lsdException w:name="Medium Grid 1" w:uiPriority="67"/>
+    <w:lsdException w:name="Medium Grid 2" w:uiPriority="68"/>
+    <w:lsdException w:name="Medium Grid 3" w:uiPriority="69"/>
+    <w:lsdException w:name="Dark List" w:uiPriority="70"/>
+    <w:lsdException w:name="Colorful Shading" w:uiPriority="71"/>
+    <w:lsdException w:name="Colorful List" w:uiPriority="72"/>
+    <w:lsdException w:name="Colorful Grid" w:uiPriority="73"/>
+    <w:lsdException w:name="Light Shading Accent 1" w:uiPriority="60"/>
+    <w:lsdException w:name="Light List Accent 1" w:uiPriority="61"/>
+    <w:lsdException w:name="Light Grid Accent 1" w:uiPriority="62"/>
+    <w:lsdException w:name="Medium Shading 1 Accent 1" w:uiPriority="63"/>
+    <w:lsdException w:name="Medium Shading 2 Accent 1" w:uiPriority="64"/>
+    <w:lsdException w:name="Medium List 1 Accent 1" w:uiPriority="65"/>
+    <w:lsdException w:name="Revision" w:semiHidden="1"/>
+    <w:lsdException w:name="List Paragraph" w:uiPriority="34" w:qFormat="1"/>
+    <w:lsdException w:name="Quote" w:uiPriority="29" w:qFormat="1"/>
+    <w:lsdException w:name="Intense Quote" w:uiPriority="30" w:qFormat="1"/>
+    <w:lsdException w:name="Medium List 2 Accent 1" w:uiPriority="66"/>
+    <w:lsdException w:name="Medium Grid 1 Accent 1" w:uiPriority="67"/>
+    <w:lsdException w:name="Medium Grid 2 Accent 1" w:uiPriority="68"/>
+    <w:lsdException w:name="Medium Grid 3 Accent 1" w:uiPriority="69"/>
+    <w:lsdException w:name="Dark List Accent 1" w:uiPriority="70"/>
+    <w:lsdException w:name="Colorful Shading Accent 1" w:uiPriority="71"/>
+    <w:lsdException w:name="Colorful List Accent 1" w:uiPriority="72"/>
+    <w:lsdException w:name="Colorful Grid Accent 1" w:uiPriority="73"/>
+    <w:lsdException w:name="Light Shading Accent 2" w:uiPriority="60"/>
+    <w:lsdException w:name="Light List Accent 2" w:uiPriority="61"/>
+    <w:lsdException w:name="Light Grid Accent 2" w:uiPriority="62"/>
+    <w:lsdException w:name="Medium Shading 1 Accent 2" w:uiPriority="63"/>
+    <w:lsdException w:name="Medium Shading 2 Accent 2" w:uiPriority="64"/>
+    <w:lsdException w:name="Medium List 1 Accent 2" w:uiPriority="65"/>
+    <w:lsdException w:name="Medium List 2 Accent 2" w:uiPriority="66"/>
+    <w:lsdException w:name="Medium Grid 1 Accent 2" w:uiPriority="67"/>
+    <w:lsdException w:name="Medium Grid 2 Accent 2" w:uiPriority="68"/>
+    <w:lsdException w:name="Medium Grid 3 Accent 2" w:uiPriority="69"/>
+    <w:lsdException w:name="Dark List Accent 2" w:uiPriority="70"/>
+    <w:lsdException w:name="Colorful Shading Accent 2" w:uiPriority="71"/>
+    <w:lsdException w:name="Colorful List Accent 2" w:uiPriority="72"/>
+    <w:lsdException w:name="Colorful Grid Accent 2" w:uiPriority="73"/>
+    <w:lsdException w:name="Light Shading Accent 3" w:uiPriority="60"/>
+    <w:lsdException w:name="Light List Accent 3" w:uiPriority="61"/>
+    <w:lsdException w:name="Light Grid Accent 3" w:uiPriority="62"/>
+    <w:lsdException w:name="Medium Shading 1 Accent 3" w:uiPriority="63"/>
+    <w:lsdException w:name="Medium Shading 2 Accent 3" w:uiPriority="64"/>
+    <w:lsdException w:name="Medium List 1 Accent 3" w:uiPriority="65"/>
+    <w:lsdException w:name="Medium List 2 Accent 3" w:uiPriority="66"/>
+    <w:lsdException w:name="Medium Grid 1 Accent 3" w:uiPriority="67"/>
+    <w:lsdException w:name="Medium Grid 2 Accent 3" w:uiPriority="68"/>
+    <w:lsdException w:name="Medium Grid 3 Accent 3" w:uiPriority="69"/>
+    <w:lsdException w:name="Dark List Accent 3" w:uiPriority="70"/>
+    <w:lsdException w:name="Colorful Shading Accent 3" w:uiPriority="71"/>
+    <w:lsdException w:name="Colorful List Accent 3" w:uiPriority="72"/>
+    <w:lsdException w:name="Colorful Grid Accent 3" w:uiPriority="73"/>
+    <w:lsdException w:name="Light Shading Accent 4" w:uiPriority="60"/>
+    <w:lsdException w:name="Light List Accent 4" w:uiPriority="61"/>
+    <w:lsdException w:name="Light Grid Accent 4" w:uiPriority="62"/>
+    <w:lsdException w:name="Medium Shading 1 Accent 4" w:uiPriority="63"/>
+    <w:lsdException w:name="Medium Shading 2 Accent 4" w:uiPriority="64"/>
+    <w:lsdException w:name="Medium List 1 Accent 4" w:uiPriority="65"/>
+    <w:lsdException w:name="Medium List 2 Accent 4" w:uiPriority="66"/>
+    <w:lsdException w:name="Medium Grid 1 Accent 4" w:uiPriority="67"/>
+    <w:lsdException w:name="Medium Grid 2 Accent 4" w:uiPriority="68"/>
+    <w:lsdException w:name="Medium Grid 3 Accent 4" w:uiPriority="69"/>
+    <w:lsdException w:name="Dark List Accent 4" w:uiPriority="70"/>
+    <w:lsdException w:name="Colorful Shading Accent 4" w:uiPriority="71"/>
+    <w:lsdException w:name="Colorful List Accent 4" w:uiPriority="72"/>
+    <w:lsdException w:name="Colorful Grid Accent 4" w:uiPriority="73"/>
+    <w:lsdException w:name="Light Shading Accent 5" w:uiPriority="60"/>
+    <w:lsdException w:name="Light List Accent 5" w:uiPriority="61"/>
+    <w:lsdException w:name="Light Grid Accent 5" w:uiPriority="62"/>
+    <w:lsdException w:name="Medium Shading 1 Accent 5" w:uiPriority="63"/>
+    <w:lsdException w:name="Medium Shading 2 Accent 5" w:uiPriority="64"/>
+    <w:lsdException w:name="Medium List 1 Accent 5" w:uiPriority="65"/>
+    <w:lsdException w:name="Medium List 2 Accent 5" w:uiPriority="66"/>
+    <w:lsdException w:name="Medium Grid 1 Accent 5" w:uiPriority="67"/>
+    <w:lsdException w:name="Medium Grid 2 Accent 5" w:uiPriority="68"/>
+    <w:lsdException w:name="Medium Grid 3 Accent 5" w:uiPriority="69"/>
+    <w:lsdException w:name="Dark List Accent 5" w:uiPriority="70"/>
+    <w:lsdException w:name="Colorful Shading Accent 5" w:uiPriority="71"/>
+    <w:lsdException w:name="Colorful List Accent 5" w:uiPriority="72"/>
+    <w:lsdException w:name="Colorful Grid Accent 5" w:uiPriority="73"/>
+    <w:lsdException w:name="Light Shading Accent 6" w:uiPriority="60"/>
+    <w:lsdException w:name="Light List Accent 6" w:uiPriority="61"/>
+    <w:lsdException w:name="Light Grid Accent 6" w:uiPriority="62"/>
+    <w:lsdException w:name="Medium Shading 1 Accent 6" w:uiPriority="63"/>
+    <w:lsdException w:name="Medium Shading 2 Accent 6" w:uiPriority="64"/>
+    <w:lsdException w:name="Medium List 1 Accent 6" w:uiPriority="65"/>
+    <w:lsdException w:name="Medium List 2 Accent 6" w:uiPriority="66"/>
+    <w:lsdException w:name="Medium Grid 1 Accent 6" w:uiPriority="67"/>
+    <w:lsdException w:name="Medium Grid 2 Accent 6" w:uiPriority="68"/>
+    <w:lsdException w:name="Medium Grid 3 Accent 6" w:uiPriority="69"/>
+    <w:lsdException w:name="Dark List Accent 6" w:uiPriority="70"/>
+    <w:lsdException w:name="Colorful Shading Accent 6" w:uiPriority="71"/>
+    <w:lsdException w:name="Colorful List Accent 6" w:uiPriority="72"/>
+    <w:lsdException w:name="Colorful Grid Accent 6" w:uiPriority="73"/>
+    <w:lsdException w:name="Subtle Emphasis" w:uiPriority="19" w:qFormat="1"/>
+    <w:lsdException w:name="Intense Emphasis" w:uiPriority="21" w:qFormat="1"/>
+    <w:lsdException w:name="Subtle Reference" w:uiPriority="31" w:qFormat="1"/>
+    <w:lsdException w:name="Intense Reference" w:uiPriority="32" w:qFormat="1"/>
+    <w:lsdException w:name="Book Title" w:uiPriority="33" w:qFormat="1"/>
+    <w:lsdException w:name="Bibliography" w:semiHidden="1" w:uiPriority="37" w:unhideWhenUsed="1"/>
+    <w:lsdException w:name="TOC Heading" w:semiHidden="1" w:uiPriority="39" w:unhideWhenUsed="1" w:qFormat="1"/>
+    <w:lsdException w:name="Plain Table 1" w:uiPriority="41"/>
+    <w:lsdException w:name="Plain Table 2" w:uiPriority="42"/>
+    <w:lsdException w:name="Plain Table 3" w:uiPriority="43"/>
+    <w:lsdException w:name="Plain Table 4" w:uiPriority="44"/>
+    <w:lsdException w:name="Plain Table 5" w:uiPriority="45"/>
+    <w:lsdException w:name="Grid Table Light" w:uiPriority="40"/>
+    <w:lsdException w:name="Grid Table 1 Light" w:uiPriority="46"/>
+    <w:lsdException w:name="Grid Table 2" w:uiPriority="47"/>
+    <w:lsdException w:name="Grid Table 3" w:uiPriority="48"/>
+    <w:lsdException w:name="Grid Table 4" w:uiPriority="49"/>
+    <w:lsdException w:name="Grid Table 5 Dark" w:uiPriority="50"/>
+    <w:lsdException w:name="Grid Table 6 Colorful" w:uiPriority="51"/>
+    <w:lsdException w:name="Grid Table 7 Colorful" w:uiPriority="52"/>
+    <w:lsdException w:name="Grid Table 1 Light Accent 1" w:uiPriority="46"/>
+    <w:lsdException w:name="Grid Table 2 Accent 1" w:uiPriority="47"/>
+    <w:lsdException w:name="Grid Table 3 Accent 1" w:uiPriority="48"/>
+    <w:lsdException w:name="Grid Table 4 Accent 1" w:uiPriority="49"/>
+    <w:lsdException w:name="Grid Table 5 Dark Accent 1" w:uiPriority="50"/>
+    <w:lsdException w:name="Grid Table 6 Colorful Accent 1" w:uiPriority="51"/>
+    <w:lsdException w:name="Grid Table 7 Colorful Accent 1" w:uiPriority="52"/>
+    <w:lsdException w:name="Grid Table 1 Light Accent 2" w:uiPriority="46"/>
+    <w:lsdException w:name="Grid Table 2 Accent 2" w:uiPriority="47"/>
+    <w:lsdException w:name="Grid Table 3 Accent 2" w:uiPriority="48"/>
+    <w:lsdException w:name="Grid Table 4 Accent 2" w:uiPriority="49"/>
+    <w:lsdException w:name="Grid Table 5 Dark Accent 2" w:uiPriority="50"/>
+    <w:lsdException w:name="Grid Table 6 Colorful Accent 2" w:uiPriority="51"/>
+    <w:lsdException w:name="Grid Table 7 Colorful Accent 2" w:uiPriority="52"/>
+    <w:lsdException w:name="Grid Table 1 Light Accent 3" w:uiPriority="46"/>
+    <w:lsdException w:name="Grid Table 2 Accent 3" w:uiPriority="47"/>
+    <w:lsdException w:name="Grid Table 3 Accent 3" w:uiPriority="48"/>
+    <w:lsdException w:name="Grid Table 4 Accent 3" w:uiPriority="49"/>
+    <w:lsdException w:name="Grid Table 5 Dark Accent 3" w:uiPriority="50"/>
+    <w:lsdException w:name="Grid Table 6 Colorful Accent 3" w:uiPriority="51"/>
+    <w:lsdException w:name="Grid Table 7 Colorful Accent 3" w:uiPriority="52"/>
+    <w:lsdException w:name="Grid Table 1 Light Accent 4" w:uiPriority="46"/>
+    <w:lsdException w:name="Grid Table 2 Accent 4" w:uiPriority="47"/>
+    <w:lsdException w:name="Grid Table 3 Accent 4" w:uiPriority="48"/>
+    <w:lsdException w:name="Grid Table 4 Accent 4" w:uiPriority="49"/>
+    <w:lsdException w:name="Grid Table 5 Dark Accent 4" w:uiPriority="50"/>
+    <w:lsdException w:name="Grid Table 6 Colorful Accent 4" w:uiPriority="51"/>
+    <w:lsdException w:name="Grid Table 7 Colorful Accent 4" w:uiPriority="52"/>
+    <w:lsdException w:name="Grid Table 1 Light Accent 5" w:uiPriority="46"/>
+    <w:lsdException w:name="Grid Table 2 Accent 5" w:uiPriority="47"/>
+    <w:lsdException w:name="Grid Table 3 Accent 5" w:uiPriority="48"/>
+    <w:lsdException w:name="Grid Table 4 Accent 5" w:uiPriority="49"/>
+    <w:lsdException w:name="Grid Table 5 Dark Accent 5" w:uiPriority="50"/>
+    <w:lsdException w:name="Grid Table 6 Colorful Accent 5" w:uiPriority="51"/>
+    <w:lsdException w:name="Grid Table 7 Colorful Accent 5" w:uiPriority="52"/>
+    <w:lsdException w:name="Grid Table 1 Light Accent 6" w:uiPriority="46"/>
+    <w:lsdException w:name="Grid Table 2 Accent 6" w:uiPriority="47"/>
+    <w:lsdException w:name="Grid Table 3 Accent 6" w:uiPriority="48"/>
+    <w:lsdException w:name="Grid Table 4 Accent 6" w:uiPriority="49"/>
+    <w:lsdException w:name="Grid Table 5 Dark Accent 6" w:uiPriority="50"/>
+    <w:lsdException w:name="Grid Table 6 Colorful Accent 6" w:uiPriority="51"/>
+    <w:lsdException w:name="Grid Table 7 Colorful Accent 6" w:uiPriority="52"/>
+    <w:lsdException w:name="List Table 1 Light" w:uiPriority="46"/>
+    <w:lsdException w:name="List Table 2" w:uiPriority="47"/>
+    <w:lsdException w:name="List Table 3" w:uiPriority="48"/>
+    <w:lsdException w:name="List Table 4" w:uiPriority="49"/>
+    <w:lsdException w:name="List Table 5 Dark" w:uiPriority="50"/>
+    <w:lsdException w:name="List Table 6 Colorful" w:uiPriority="51"/>
+    <w:lsdException w:name="List Table 7 Colorful" w:uiPriority="52"/>
+    <w:lsdException w:name="List Table 1 Light Accent 1" w:uiPriority="46"/>
+    <w:lsdException w:name="List Table 2 Accent 1" w:uiPriority="47"/>
+    <w:lsdException w:name="List Table 3 Accent 1" w:uiPriority="48"/>
+    <w:lsdException w:name="List Table 4 Accent 1" w:uiPriority="49"/>
+    <w:lsdException w:name="List Table 5 Dark Accent 1" w:uiPriority="50"/>
+    <w:lsdException w:name="List Table 6 Colorful Accent 1" w:uiPriority="51"/>
+    <w:lsdException w:name="List Table 7 Colorful Accent 1" w:uiPriority="52"/>
+    <w:lsdException w:name="List Table 1 Light Accent 2" w:uiPriority="46"/>
+    <w:lsdException w:name="List Table 2 Accent 2" w:uiPriority="47"/>
+    <w:lsdException w:name="List Table 3 Accent 2" w:uiPriority="48"/>
+    <w:lsdException w:name="List Table 4 Accent 2" w:uiPriority="49"/>
+    <w:lsdException w:name="List Table 5 Dark Accent 2" w:uiPriority="50"/>
+    <w:lsdException w:name="List Table 6 Colorful Accent 2" w:uiPriority="51"/>
+    <w:lsdException w:name="List Table 7 Colorful Accent 2" w:uiPriority="52"/>
+    <w:lsdException w:name="List Table 1 Light Accent 3" w:uiPriority="46"/>
+    <w:lsdException w:name="List Table 2 Accent 3" w:uiPriority="47"/>
+    <w:lsdException w:name="List Table 3 Accent 3" w:uiPriority="48"/>
+    <w:lsdException w:name="List Table 4 Accent 3" w:uiPriority="49"/>
+    <w:lsdException w:name="List Table 5 Dark Accent 3" w:uiPriority="50"/>
+    <w:lsdException w:name="List Table 6 Colorful Accent 3" w:uiPriority="51"/>
+    <w:lsdException w:name="List Table 7 Colorful Accent 3" w:uiPriority="52"/>
+    <w:lsdException w:name="List Table 1 Light Accent 4" w:uiPriority="46"/>
+    <w:lsdException w:name="List Table 2 Accent 4" w:uiPriority="47"/>
+    <w:lsdException w:name="List Table 3 Accent 4" w:uiPriority="48"/>
+    <w:lsdException w:name="List Table 4 Accent 4" w:uiPriority="49"/>
+    <w:lsdException w:name="List Table 5 Dark Accent 4" w:uiPriority="50"/>
+    <w:lsdException w:name="List Table 6 Colorful Accent 4" w:uiPriority="51"/>
+    <w:lsdException w:name="List Table 7 Colorful Accent 4" w:uiPriority="52"/>
+    <w:lsdException w:name="List Table 1 Light Accent 5" w:uiPriority="46"/>
+    <w:lsdException w:name="List Table 2 Accent 5" w:uiPriority="47"/>
+    <w:lsdException w:name="List Table 3 Accent 5" w:uiPriority="48"/>
+    <w:lsdException w:name="List Table 4 Accent 5" w:uiPriority="49"/>
+    <w:lsdException w:name="List Table 5 Dark Accent 5" w:uiPriority="50"/>
+    <w:lsdException w:name="List Table 6 Colorful Accent 5" w:uiPriority="51"/>
+    <w:lsdException w:name="List Table 7 Colorful Accent 5" w:uiPriority="52"/>
+    <w:lsdException w:name="List Table 1 Light Accent 6" w:uiPriority="46"/>
+    <w:lsdException w:name="List Table 2 Accent 6" w:uiPriority="47"/>
+    <w:lsdException w:name="List Table 3 Accent 6" w:uiPriority="48"/>
+    <w:lsdException w:name="List Table 4 Accent 6" w:uiPriority="49"/>
+    <w:lsdException w:name="List Table 5 Dark Accent 6" w:uiPriority="50"/>
+    <w:lsdException w:name="List Table 6 Colorful Accent 6" w:uiPriority="51"/>
+    <w:lsdException w:name="List Table 7 Colorful Accent 6" w:uiPriority="52"/>
+    <w:lsdException w:name="Mention" w:semiHidden="1" w:unhideWhenUsed="1"/>
+    <w:lsdException w:name="Smart Hyperlink" w:semiHidden="1" w:unhideWhenUsed="1"/>
+    <w:lsdException w:name="Hashtag" w:semiHidden="1" w:unhideWhenUsed="1"/>
+    <w:lsdException w:name="Unresolved Mention" w:semiHidden="1" w:unhideWhenUsed="1"/>
+    <w:lsdException w:name="Smart Link" w:semiHidden="1" w:unhideWhenUsed="1"/>
+  </w:latentStyles>
+  <w:style w:type="paragraph" w:default="1" w:styleId="Normal">
     <w:name w:val="Normal"/>
     <w:qFormat/>
   </w:style>
-  <w:style w:type="table" w:styleId="TableNormal" w:default="true">
-    <w:name w:val="Normal Table"/>
-    <w:uiPriority w:val="99"/>
-    <w:semiHidden/>
-    <w:unhideWhenUsed/>
-    <w:tblPr>
-      <w:tblInd w:type="dxa" w:w="0"/>
-      <w:tblCellMar>
-        <w:top w:type="dxa" w:w="0"/>
-        <w:left w:type="dxa" w:w="108"/>
-        <w:bottom w:type="dxa" w:w="0"/>
-        <w:right w:type="dxa" w:w="108"/>
-      </w:tblCellMar>
-    </w:tblPr>
-  </w:style>
-  <w:style w:type="paragraph" w:styleId="Title">
-    <w:name w:val="Title"/>
+  <w:style w:type="paragraph" w:styleId="Ttulo1">
+    <w:name w:val="heading 1"/>
     <w:basedOn w:val="Normal"/>
     <w:next w:val="Normal"/>
+    <w:link w:val="Ttulo1Car"/>
+    <w:uiPriority w:val="9"/>
     <w:qFormat/>
-    <w:rPr>
-      <w:sz w:val="56"/>
-      <w:szCs w:val="56"/>
-    </w:rPr>
-  </w:style>
-  <w:style w:type="paragraph" w:styleId="Heading4">
-    <w:name w:val="Heading 4"/>
-    <w:basedOn w:val="Normal"/>
-    <w:next w:val="Normal"/>
-    <w:qFormat/>
-    <w:rPr>
-      <w:i/>
-      <w:iCs/>
-      <w:color w:val="2E74B5"/>
-    </w:rPr>
-  </w:style>
-  <w:style w:type="paragraph" w:styleId="Heading5">
-    <w:name w:val="Heading 5"/>
-    <w:basedOn w:val="Normal"/>
-    <w:next w:val="Normal"/>
-    <w:qFormat/>
-    <w:rPr>
-      <w:color w:val="2E74B5"/>
-    </w:rPr>
-  </w:style>
-  <w:style w:type="paragraph" w:styleId="Heading6">
-    <w:name w:val="Heading 6"/>
-    <w:basedOn w:val="Normal"/>
-    <w:next w:val="Normal"/>
-    <w:qFormat/>
-    <w:rPr>
-      <w:color w:val="1F4D78"/>
-    </w:rPr>
-  </w:style>
-  <w:style w:type="paragraph" w:styleId="Strong">
-    <w:name w:val="Strong"/>
-    <w:basedOn w:val="Normal"/>
-    <w:next w:val="Normal"/>
-    <w:qFormat/>
-    <w:rPr>
-      <w:b/>
-      <w:bCs/>
-    </w:rPr>
-  </w:style>
-  <w:style w:type="paragraph" w:styleId="ListParagraph">
-    <w:name w:val="List Paragraph"/>
-    <w:basedOn w:val="Normal"/>
-    <w:qFormat/>
-  </w:style>
-  <w:style w:type="paragraph" w:styleId="Caption">
-    <w:name w:val="caption"/>
-    <w:basedOn w:val="Normal"/>
-    <w:next w:val="Normal"/>
-    <w:uiPriority w:val="35"/>
-    <w:semiHidden/>
-    <w:unhideWhenUsed/>
-    <w:qFormat/>
-    <w:pPr>
-      <w:spacing w:after="200"/>
-    </w:pPr>
-    <w:rPr>
-      <w:i/>
-      <w:iCs/>
-      <w:color w:val="44546A" w:themeColor="dark2"/>
-      <w:sz w:val="18"/>
-      <w:szCs w:val="18"/>
-    </w:rPr>
-  </w:style>
-  <w:style w:type="paragraph" w:styleId="Bibliography">
-    <w:name w:val="Bibliography"/>
-    <w:basedOn w:val="Normal"/>
-    <w:next w:val="Normal"/>
-    <w:uiPriority w:val="37"/>
-    <w:unhideWhenUsed/>
-  </w:style>
-  <w:style w:type="paragraph" w:styleId="TOC1">
-    <w:name w:val="toc 1"/>
-    <w:basedOn w:val="Normal"/>
-    <w:next w:val="Normal"/>
-    <w:uiPriority w:val="39"/>
-    <w:semiHidden/>
-    <w:unhideWhenUsed/>
-    <w:pPr>
-      <w:spacing w:after="100"/>
-    </w:pPr>
-  </w:style>
-  <w:style w:type="paragraph" w:styleId="TOC2">
-    <w:name w:val="toc 2"/>
-    <w:basedOn w:val="Normal"/>
-    <w:next w:val="Normal"/>
-    <w:uiPriority w:val="39"/>
-    <w:semiHidden/>
-    <w:unhideWhenUsed/>
-    <w:pPr>
-      <w:spacing w:after="100"/>
-      <w:ind w:left="240"/>
-    </w:pPr>
-  </w:style>
-  <w:style w:type="paragraph" w:styleId="TOC3">
-    <w:name w:val="toc 3"/>
-    <w:basedOn w:val="Normal"/>
-    <w:next w:val="Normal"/>
-    <w:uiPriority w:val="39"/>
-    <w:semiHidden/>
-    <w:unhideWhenUsed/>
-    <w:pPr>
-      <w:spacing w:after="100"/>
-      <w:ind w:left="480"/>
-    </w:pPr>
-  </w:style>
-  <w:style w:type="paragraph" w:styleId="TOC4">
-    <w:name w:val="toc 4"/>
-    <w:basedOn w:val="Normal"/>
-    <w:next w:val="Normal"/>
-    <w:uiPriority w:val="39"/>
-    <w:semiHidden/>
-    <w:unhideWhenUsed/>
-    <w:pPr>
-      <w:spacing w:after="100"/>
-      <w:ind w:left="720"/>
-    </w:pPr>
-  </w:style>
-  <w:style w:type="paragraph" w:styleId="TOC5">
-    <w:name w:val="toc 5"/>
-    <w:basedOn w:val="Normal"/>
-    <w:next w:val="Normal"/>
-    <w:uiPriority w:val="39"/>
-    <w:semiHidden/>
-    <w:unhideWhenUsed/>
-    <w:pPr>
-      <w:spacing w:after="100"/>
-      <w:ind w:left="960"/>
-    </w:pPr>
-  </w:style>
-  <w:style w:type="paragraph" w:styleId="TOC6">
-    <w:name w:val="toc 6"/>
-    <w:basedOn w:val="Normal"/>
-    <w:next w:val="Normal"/>
-    <w:uiPriority w:val="39"/>
-    <w:semiHidden/>
-    <w:unhideWhenUsed/>
-    <w:pPr>
-      <w:spacing w:after="100"/>
-      <w:ind w:left="1200"/>
-    </w:pPr>
-  </w:style>
-  <w:style w:type="paragraph" w:styleId="TOC7">
-    <w:name w:val="toc 7"/>
-    <w:basedOn w:val="Normal"/>
-    <w:next w:val="Normal"/>
-    <w:uiPriority w:val="39"/>
-    <w:semiHidden/>
-    <w:unhideWhenUsed/>
-    <w:pPr>
-      <w:spacing w:after="100"/>
-      <w:ind w:left="1440"/>
-    </w:pPr>
-  </w:style>
-  <w:style w:type="paragraph" w:styleId="TOC8">
-    <w:name w:val="toc 8"/>
-    <w:basedOn w:val="Normal"/>
-    <w:next w:val="Normal"/>
-    <w:uiPriority w:val="39"/>
-    <w:semiHidden/>
-    <w:unhideWhenUsed/>
-    <w:pPr>
-      <w:spacing w:after="100"/>
-      <w:ind w:left="1680"/>
-    </w:pPr>
-  </w:style>
-  <w:style w:type="paragraph" w:styleId="TOC9">
-    <w:name w:val="toc 9"/>
-    <w:basedOn w:val="Normal"/>
-    <w:next w:val="Normal"/>
-    <w:uiPriority w:val="39"/>
-    <w:semiHidden/>
-    <w:unhideWhenUsed/>
-    <w:pPr>
-      <w:spacing w:after="100"/>
-      <w:ind w:left="1920"/>
-    </w:pPr>
-  </w:style>
-  <w:style w:type="character" w:styleId="Hyperlink">
-    <w:name w:val="Hyperlink"/>
-    <w:basedOn w:val="DefaultParagraphFont"/>
-    <w:uiPriority w:val="99"/>
-    <w:unhideWhenUsed/>
-    <w:rPr>
-      <w:color w:val="0563C1"/>
-      <w:u w:val="single"/>
-    </w:rPr>
-  </w:style>
-  <w:style w:type="character" w:styleId="FootnoteReference">
-    <w:name w:val="footnote reference"/>
-    <w:basedOn w:val="DefaultParagraphFont"/>
-    <w:uiPriority w:val="99"/>
-    <w:semiHidden/>
-    <w:unhideWhenUsed/>
-    <w:rPr>
-      <w:vertAlign w:val="superscript"/>
-    </w:rPr>
-  </w:style>
-  <w:style w:type="paragraph" w:styleId="FootnoteText">
-    <w:name w:val="footnote text"/>
-    <w:basedOn w:val="Normal"/>
-    <w:link w:val="FootnoteTextChar"/>
-    <w:uiPriority w:val="99"/>
-    <w:semiHidden/>
-    <w:unhideWhenUsed/>
-    <w:pPr>
-      <w:spacing w:after="0" w:line="240" w:lineRule="auto"/>
-    </w:pPr>
-    <w:rPr>
-      <w:sz w:val="20"/>
-      <w:szCs w:val="20"/>
-    </w:rPr>
-  </w:style>
-  <w:style w:type="character" w:styleId="FootnoteTextChar">
-    <w:name w:val="Footnote Text Char"/>
-    <w:basedOn w:val="DefaultParagraphFont"/>
-    <w:link w:val="FootnoteText"/>
-    <w:uiPriority w:val="99"/>
-    <w:semiHidden/>
-    <w:unhideWhenUsed/>
-    <w:rPr>
-      <w:sz w:val="20"/>
-      <w:szCs w:val="20"/>
-    </w:rPr>
-  </w:style>
-  <w:style w:type="character" w:styleId="EndnoteReference">
-    <w:name w:val="endnote reference"/>
-    <w:basedOn w:val="DefaultParagraphFont"/>
-    <w:uiPriority w:val="99"/>
-    <w:semiHidden/>
-    <w:unhideWhenUsed/>
-    <w:rPr>
-      <w:vertAlign w:val="superscript"/>
-    </w:rPr>
-  </w:style>
-  <w:style w:type="paragraph" w:styleId="EndnoteText">
-    <w:name w:val="endnote text"/>
-    <w:basedOn w:val="Normal"/>
-    <w:link w:val="EndnoteTextChar"/>
-    <w:uiPriority w:val="99"/>
-    <w:semiHidden/>
-    <w:unhideWhenUsed/>
-    <w:pPr>
-      <w:spacing w:after="0" w:line="240" w:lineRule="auto"/>
-    </w:pPr>
-    <w:rPr>
-      <w:sz w:val="20"/>
-      <w:szCs w:val="20"/>
-    </w:rPr>
-  </w:style>
-  <w:style w:type="character" w:styleId="EndnoteTextChar">
-    <w:name w:val="Endnote Text Char"/>
-    <w:basedOn w:val="DefaultParagraphFont"/>
-    <w:link w:val="EndnoteText"/>
-    <w:uiPriority w:val="99"/>
-    <w:semiHidden/>
-    <w:unhideWhenUsed/>
-    <w:rPr>
-      <w:sz w:val="20"/>
-      <w:szCs w:val="20"/>
-    </w:rPr>
-  </w:style>
-  <w:style w:type="character" w:styleId="LineNumber">
-    <w:name w:val="line number"/>
-    <w:basedOn w:val="DefaultParagraphFont"/>
-    <w:uiPriority w:val="99"/>
-    <w:semiHidden/>
-    <w:unhideWhenUsed/>
-  </w:style>
-  <w:style w:type="paragraph" w:styleId="Heading1">
-    <w:name w:val="Heading 1"/>
-    <w:basedOn w:val="Normal"/>
-    <w:next w:val="Normal"/>
-    <w:qFormat/>
+    <w:rsid w:val="00F8326F"/>
     <w:pPr>
       <w:keepNext/>
-      <w:spacing w:after="0" w:before="0" w:line="480"/>
+      <w:keepLines/>
+      <w:spacing w:before="0" w:after="0" w:line="480" w:lineRule="auto"/>
       <w:jc w:val="center"/>
       <w:outlineLvl w:val="0"/>
     </w:pPr>
     <w:rPr>
-      <w:rFonts w:ascii="Times New Roman" w:cs="Times New Roman" w:eastAsia="Times New Roman" w:hAnsi="Times New Roman"/>
+      <w:rFonts w:ascii="Times New Roman" w:eastAsia="Times New Roman" w:hAnsi="Times New Roman" w:cs="Times New Roman"/>
       <w:b/>
       <w:bCs/>
       <w:color w:val="000000"/>
@@ -23610,18 +23794,24 @@
       <w:szCs w:val="24"/>
     </w:rPr>
   </w:style>
-  <w:style w:type="paragraph" w:styleId="Heading2">
-    <w:name w:val="Heading 2"/>
+  <w:style w:type="paragraph" w:styleId="Ttulo2">
+    <w:name w:val="heading 2"/>
     <w:basedOn w:val="Normal"/>
     <w:next w:val="Normal"/>
+    <w:link w:val="Ttulo2Car"/>
+    <w:uiPriority w:val="9"/>
+    <w:semiHidden/>
+    <w:unhideWhenUsed/>
     <w:qFormat/>
+    <w:rsid w:val="00F8326F"/>
     <w:pPr>
       <w:keepNext/>
-      <w:spacing w:after="0" w:before="0" w:line="480"/>
+      <w:keepLines/>
+      <w:spacing w:before="0" w:after="0" w:line="480" w:lineRule="auto"/>
       <w:outlineLvl w:val="1"/>
     </w:pPr>
     <w:rPr>
-      <w:rFonts w:ascii="Times New Roman" w:cs="Times New Roman" w:eastAsia="Times New Roman" w:hAnsi="Times New Roman"/>
+      <w:rFonts w:ascii="Times New Roman" w:eastAsia="Times New Roman" w:hAnsi="Times New Roman" w:cs="Times New Roman"/>
       <w:b/>
       <w:bCs/>
       <w:color w:val="000000"/>
@@ -23629,18 +23819,24 @@
       <w:szCs w:val="24"/>
     </w:rPr>
   </w:style>
-  <w:style w:type="paragraph" w:styleId="Heading3">
-    <w:name w:val="Heading 3"/>
+  <w:style w:type="paragraph" w:styleId="Ttulo3">
+    <w:name w:val="heading 3"/>
     <w:basedOn w:val="Normal"/>
     <w:next w:val="Normal"/>
+    <w:link w:val="Ttulo3Car"/>
+    <w:uiPriority w:val="9"/>
+    <w:semiHidden/>
+    <w:unhideWhenUsed/>
     <w:qFormat/>
+    <w:rsid w:val="00F8326F"/>
     <w:pPr>
       <w:keepNext/>
-      <w:spacing w:after="0" w:before="0" w:line="480"/>
+      <w:keepLines/>
+      <w:spacing w:before="0" w:after="0" w:line="480" w:lineRule="auto"/>
       <w:outlineLvl w:val="2"/>
     </w:pPr>
     <w:rPr>
-      <w:rFonts w:ascii="Times New Roman" w:cs="Times New Roman" w:eastAsia="Times New Roman" w:hAnsi="Times New Roman"/>
+      <w:rFonts w:ascii="Times New Roman" w:eastAsia="Times New Roman" w:hAnsi="Times New Roman" w:cs="Times New Roman"/>
       <w:b/>
       <w:bCs/>
       <w:i/>
@@ -23649,6 +23845,505 @@
       <w:sz w:val="24"/>
       <w:szCs w:val="24"/>
     </w:rPr>
+  </w:style>
+  <w:style w:type="paragraph" w:styleId="Ttulo4">
+    <w:name w:val="heading 4"/>
+    <w:basedOn w:val="Normal"/>
+    <w:next w:val="Normal"/>
+    <w:link w:val="Ttulo4Car"/>
+    <w:uiPriority w:val="9"/>
+    <w:semiHidden/>
+    <w:unhideWhenUsed/>
+    <w:qFormat/>
+    <w:rsid w:val="00F8326F"/>
+    <w:pPr>
+      <w:keepNext/>
+      <w:keepLines/>
+      <w:spacing w:before="80" w:after="40"/>
+      <w:outlineLvl w:val="3"/>
+    </w:pPr>
+    <w:rPr>
+      <w:rFonts w:eastAsiaTheme="majorEastAsia" w:cstheme="majorBidi"/>
+      <w:i/>
+      <w:iCs/>
+      <w:color w:val="0F4761" w:themeColor="accent1" w:themeShade="BF"/>
+    </w:rPr>
+  </w:style>
+  <w:style w:type="paragraph" w:styleId="Ttulo5">
+    <w:name w:val="heading 5"/>
+    <w:basedOn w:val="Normal"/>
+    <w:next w:val="Normal"/>
+    <w:link w:val="Ttulo5Car"/>
+    <w:uiPriority w:val="9"/>
+    <w:semiHidden/>
+    <w:unhideWhenUsed/>
+    <w:qFormat/>
+    <w:rsid w:val="00F8326F"/>
+    <w:pPr>
+      <w:keepNext/>
+      <w:keepLines/>
+      <w:spacing w:before="80" w:after="40"/>
+      <w:outlineLvl w:val="4"/>
+    </w:pPr>
+    <w:rPr>
+      <w:rFonts w:eastAsiaTheme="majorEastAsia" w:cstheme="majorBidi"/>
+      <w:color w:val="0F4761" w:themeColor="accent1" w:themeShade="BF"/>
+    </w:rPr>
+  </w:style>
+  <w:style w:type="paragraph" w:styleId="Ttulo6">
+    <w:name w:val="heading 6"/>
+    <w:basedOn w:val="Normal"/>
+    <w:next w:val="Normal"/>
+    <w:link w:val="Ttulo6Car"/>
+    <w:uiPriority w:val="9"/>
+    <w:semiHidden/>
+    <w:unhideWhenUsed/>
+    <w:qFormat/>
+    <w:rsid w:val="00F8326F"/>
+    <w:pPr>
+      <w:keepNext/>
+      <w:keepLines/>
+      <w:spacing w:before="40" w:after="0"/>
+      <w:outlineLvl w:val="5"/>
+    </w:pPr>
+    <w:rPr>
+      <w:rFonts w:eastAsiaTheme="majorEastAsia" w:cstheme="majorBidi"/>
+      <w:i/>
+      <w:iCs/>
+      <w:color w:val="595959" w:themeColor="text1" w:themeTint="A6"/>
+    </w:rPr>
+  </w:style>
+  <w:style w:type="paragraph" w:styleId="Ttulo7">
+    <w:name w:val="heading 7"/>
+    <w:basedOn w:val="Normal"/>
+    <w:next w:val="Normal"/>
+    <w:link w:val="Ttulo7Car"/>
+    <w:uiPriority w:val="9"/>
+    <w:semiHidden/>
+    <w:unhideWhenUsed/>
+    <w:qFormat/>
+    <w:rsid w:val="00F8326F"/>
+    <w:pPr>
+      <w:keepNext/>
+      <w:keepLines/>
+      <w:spacing w:before="40" w:after="0"/>
+      <w:outlineLvl w:val="6"/>
+    </w:pPr>
+    <w:rPr>
+      <w:rFonts w:eastAsiaTheme="majorEastAsia" w:cstheme="majorBidi"/>
+      <w:color w:val="595959" w:themeColor="text1" w:themeTint="A6"/>
+    </w:rPr>
+  </w:style>
+  <w:style w:type="paragraph" w:styleId="Ttulo8">
+    <w:name w:val="heading 8"/>
+    <w:basedOn w:val="Normal"/>
+    <w:next w:val="Normal"/>
+    <w:link w:val="Ttulo8Car"/>
+    <w:uiPriority w:val="9"/>
+    <w:semiHidden/>
+    <w:unhideWhenUsed/>
+    <w:qFormat/>
+    <w:rsid w:val="00F8326F"/>
+    <w:pPr>
+      <w:keepNext/>
+      <w:keepLines/>
+      <w:spacing w:after="0"/>
+      <w:outlineLvl w:val="7"/>
+    </w:pPr>
+    <w:rPr>
+      <w:rFonts w:eastAsiaTheme="majorEastAsia" w:cstheme="majorBidi"/>
+      <w:i/>
+      <w:iCs/>
+      <w:color w:val="272727" w:themeColor="text1" w:themeTint="D8"/>
+    </w:rPr>
+  </w:style>
+  <w:style w:type="paragraph" w:styleId="Ttulo9">
+    <w:name w:val="heading 9"/>
+    <w:basedOn w:val="Normal"/>
+    <w:next w:val="Normal"/>
+    <w:link w:val="Ttulo9Car"/>
+    <w:uiPriority w:val="9"/>
+    <w:semiHidden/>
+    <w:unhideWhenUsed/>
+    <w:qFormat/>
+    <w:rsid w:val="00F8326F"/>
+    <w:pPr>
+      <w:keepNext/>
+      <w:keepLines/>
+      <w:spacing w:after="0"/>
+      <w:outlineLvl w:val="8"/>
+    </w:pPr>
+    <w:rPr>
+      <w:rFonts w:eastAsiaTheme="majorEastAsia" w:cstheme="majorBidi"/>
+      <w:color w:val="272727" w:themeColor="text1" w:themeTint="D8"/>
+    </w:rPr>
+  </w:style>
+  <w:style w:type="character" w:default="1" w:styleId="Fuentedeprrafopredeter">
+    <w:name w:val="Default Paragraph Font"/>
+    <w:uiPriority w:val="1"/>
+    <w:semiHidden/>
+    <w:unhideWhenUsed/>
+  </w:style>
+  <w:style w:type="table" w:default="1" w:styleId="Tablanormal">
+    <w:name w:val="Normal Table"/>
+    <w:uiPriority w:val="99"/>
+    <w:semiHidden/>
+    <w:unhideWhenUsed/>
+    <w:tblPr>
+      <w:tblInd w:w="0" w:type="dxa"/>
+      <w:tblCellMar>
+        <w:top w:w="0" w:type="dxa"/>
+        <w:left w:w="108" w:type="dxa"/>
+        <w:bottom w:w="0" w:type="dxa"/>
+        <w:right w:w="108" w:type="dxa"/>
+      </w:tblCellMar>
+    </w:tblPr>
+  </w:style>
+  <w:style w:type="numbering" w:default="1" w:styleId="Sinlista">
+    <w:name w:val="No List"/>
+    <w:uiPriority w:val="99"/>
+    <w:semiHidden/>
+    <w:unhideWhenUsed/>
+  </w:style>
+  <w:style w:type="character" w:customStyle="1" w:styleId="Ttulo1Car">
+    <w:name w:val="Título 1 Car"/>
+    <w:basedOn w:val="Fuentedeprrafopredeter"/>
+    <w:link w:val="Ttulo1"/>
+    <w:uiPriority w:val="9"/>
+    <w:rsid w:val="00F8326F"/>
+    <w:rPr>
+      <w:rFonts w:ascii="Times New Roman" w:eastAsia="Times New Roman" w:hAnsi="Times New Roman" w:cs="Times New Roman"/>
+      <w:b/>
+      <w:bCs/>
+      <w:color w:val="000000"/>
+      <w:sz w:val="24"/>
+      <w:szCs w:val="24"/>
+    </w:rPr>
+  </w:style>
+  <w:style w:type="character" w:customStyle="1" w:styleId="Ttulo2Car">
+    <w:name w:val="Título 2 Car"/>
+    <w:basedOn w:val="Fuentedeprrafopredeter"/>
+    <w:link w:val="Ttulo2"/>
+    <w:uiPriority w:val="9"/>
+    <w:semiHidden/>
+    <w:rsid w:val="00F8326F"/>
+    <w:rPr>
+      <w:rFonts w:ascii="Times New Roman" w:eastAsia="Times New Roman" w:hAnsi="Times New Roman" w:cs="Times New Roman"/>
+      <w:b/>
+      <w:bCs/>
+      <w:color w:val="000000"/>
+      <w:sz w:val="24"/>
+      <w:szCs w:val="24"/>
+    </w:rPr>
+  </w:style>
+  <w:style w:type="character" w:customStyle="1" w:styleId="Ttulo3Car">
+    <w:name w:val="Título 3 Car"/>
+    <w:basedOn w:val="Fuentedeprrafopredeter"/>
+    <w:link w:val="Ttulo3"/>
+    <w:uiPriority w:val="9"/>
+    <w:semiHidden/>
+    <w:rsid w:val="00F8326F"/>
+    <w:rPr>
+      <w:rFonts w:ascii="Times New Roman" w:eastAsia="Times New Roman" w:hAnsi="Times New Roman" w:cs="Times New Roman"/>
+      <w:b/>
+      <w:bCs/>
+      <w:color w:val="000000"/>
+      <w:sz w:val="24"/>
+      <w:szCs w:val="24"/>
+    </w:rPr>
+  </w:style>
+  <w:style w:type="character" w:customStyle="1" w:styleId="Ttulo4Car">
+    <w:name w:val="Título 4 Car"/>
+    <w:basedOn w:val="Fuentedeprrafopredeter"/>
+    <w:link w:val="Ttulo4"/>
+    <w:uiPriority w:val="9"/>
+    <w:semiHidden/>
+    <w:rsid w:val="00F8326F"/>
+    <w:rPr>
+      <w:rFonts w:eastAsiaTheme="majorEastAsia" w:cstheme="majorBidi"/>
+      <w:i/>
+      <w:iCs/>
+      <w:color w:val="0F4761" w:themeColor="accent1" w:themeShade="BF"/>
+    </w:rPr>
+  </w:style>
+  <w:style w:type="character" w:customStyle="1" w:styleId="Ttulo5Car">
+    <w:name w:val="Título 5 Car"/>
+    <w:basedOn w:val="Fuentedeprrafopredeter"/>
+    <w:link w:val="Ttulo5"/>
+    <w:uiPriority w:val="9"/>
+    <w:semiHidden/>
+    <w:rsid w:val="00F8326F"/>
+    <w:rPr>
+      <w:rFonts w:eastAsiaTheme="majorEastAsia" w:cstheme="majorBidi"/>
+      <w:color w:val="0F4761" w:themeColor="accent1" w:themeShade="BF"/>
+    </w:rPr>
+  </w:style>
+  <w:style w:type="character" w:customStyle="1" w:styleId="Ttulo6Car">
+    <w:name w:val="Título 6 Car"/>
+    <w:basedOn w:val="Fuentedeprrafopredeter"/>
+    <w:link w:val="Ttulo6"/>
+    <w:uiPriority w:val="9"/>
+    <w:semiHidden/>
+    <w:rsid w:val="00F8326F"/>
+    <w:rPr>
+      <w:rFonts w:eastAsiaTheme="majorEastAsia" w:cstheme="majorBidi"/>
+      <w:i/>
+      <w:iCs/>
+      <w:color w:val="595959" w:themeColor="text1" w:themeTint="A6"/>
+    </w:rPr>
+  </w:style>
+  <w:style w:type="character" w:customStyle="1" w:styleId="Ttulo7Car">
+    <w:name w:val="Título 7 Car"/>
+    <w:basedOn w:val="Fuentedeprrafopredeter"/>
+    <w:link w:val="Ttulo7"/>
+    <w:uiPriority w:val="9"/>
+    <w:semiHidden/>
+    <w:rsid w:val="00F8326F"/>
+    <w:rPr>
+      <w:rFonts w:eastAsiaTheme="majorEastAsia" w:cstheme="majorBidi"/>
+      <w:color w:val="595959" w:themeColor="text1" w:themeTint="A6"/>
+    </w:rPr>
+  </w:style>
+  <w:style w:type="character" w:customStyle="1" w:styleId="Ttulo8Car">
+    <w:name w:val="Título 8 Car"/>
+    <w:basedOn w:val="Fuentedeprrafopredeter"/>
+    <w:link w:val="Ttulo8"/>
+    <w:uiPriority w:val="9"/>
+    <w:semiHidden/>
+    <w:rsid w:val="00F8326F"/>
+    <w:rPr>
+      <w:rFonts w:eastAsiaTheme="majorEastAsia" w:cstheme="majorBidi"/>
+      <w:i/>
+      <w:iCs/>
+      <w:color w:val="272727" w:themeColor="text1" w:themeTint="D8"/>
+    </w:rPr>
+  </w:style>
+  <w:style w:type="character" w:customStyle="1" w:styleId="Ttulo9Car">
+    <w:name w:val="Título 9 Car"/>
+    <w:basedOn w:val="Fuentedeprrafopredeter"/>
+    <w:link w:val="Ttulo9"/>
+    <w:uiPriority w:val="9"/>
+    <w:semiHidden/>
+    <w:rsid w:val="00F8326F"/>
+    <w:rPr>
+      <w:rFonts w:eastAsiaTheme="majorEastAsia" w:cstheme="majorBidi"/>
+      <w:color w:val="272727" w:themeColor="text1" w:themeTint="D8"/>
+    </w:rPr>
+  </w:style>
+  <w:style w:type="paragraph" w:styleId="Ttulo">
+    <w:name w:val="Title"/>
+    <w:basedOn w:val="Normal"/>
+    <w:next w:val="Normal"/>
+    <w:link w:val="TtuloCar"/>
+    <w:uiPriority w:val="10"/>
+    <w:qFormat/>
+    <w:rsid w:val="00F8326F"/>
+    <w:pPr>
+      <w:spacing w:after="80" w:line="240" w:lineRule="auto"/>
+      <w:contextualSpacing/>
+    </w:pPr>
+    <w:rPr>
+      <w:rFonts w:asciiTheme="majorHAnsi" w:eastAsiaTheme="majorEastAsia" w:hAnsiTheme="majorHAnsi" w:cstheme="majorBidi"/>
+      <w:spacing w:val="-10"/>
+      <w:kern w:val="28"/>
+      <w:sz w:val="56"/>
+      <w:szCs w:val="56"/>
+    </w:rPr>
+  </w:style>
+  <w:style w:type="character" w:customStyle="1" w:styleId="TtuloCar">
+    <w:name w:val="Título Car"/>
+    <w:basedOn w:val="Fuentedeprrafopredeter"/>
+    <w:link w:val="Ttulo"/>
+    <w:uiPriority w:val="10"/>
+    <w:rsid w:val="00F8326F"/>
+    <w:rPr>
+      <w:rFonts w:asciiTheme="majorHAnsi" w:eastAsiaTheme="majorEastAsia" w:hAnsiTheme="majorHAnsi" w:cstheme="majorBidi"/>
+      <w:spacing w:val="-10"/>
+      <w:kern w:val="28"/>
+      <w:sz w:val="56"/>
+      <w:szCs w:val="56"/>
+    </w:rPr>
+  </w:style>
+  <w:style w:type="paragraph" w:styleId="Subttulo">
+    <w:name w:val="Subtitle"/>
+    <w:basedOn w:val="Normal"/>
+    <w:next w:val="Normal"/>
+    <w:link w:val="SubttuloCar"/>
+    <w:uiPriority w:val="11"/>
+    <w:qFormat/>
+    <w:rsid w:val="00F8326F"/>
+    <w:pPr>
+      <w:numPr>
+        <w:ilvl w:val="1"/>
+      </w:numPr>
+    </w:pPr>
+    <w:rPr>
+      <w:rFonts w:eastAsiaTheme="majorEastAsia" w:cstheme="majorBidi"/>
+      <w:color w:val="595959" w:themeColor="text1" w:themeTint="A6"/>
+      <w:spacing w:val="15"/>
+      <w:sz w:val="28"/>
+      <w:szCs w:val="28"/>
+    </w:rPr>
+  </w:style>
+  <w:style w:type="character" w:customStyle="1" w:styleId="SubttuloCar">
+    <w:name w:val="Subtítulo Car"/>
+    <w:basedOn w:val="Fuentedeprrafopredeter"/>
+    <w:link w:val="Subttulo"/>
+    <w:uiPriority w:val="11"/>
+    <w:rsid w:val="00F8326F"/>
+    <w:rPr>
+      <w:rFonts w:eastAsiaTheme="majorEastAsia" w:cstheme="majorBidi"/>
+      <w:color w:val="595959" w:themeColor="text1" w:themeTint="A6"/>
+      <w:spacing w:val="15"/>
+      <w:sz w:val="28"/>
+      <w:szCs w:val="28"/>
+    </w:rPr>
+  </w:style>
+  <w:style w:type="paragraph" w:styleId="Cita">
+    <w:name w:val="Quote"/>
+    <w:basedOn w:val="Normal"/>
+    <w:next w:val="Normal"/>
+    <w:link w:val="CitaCar"/>
+    <w:uiPriority w:val="29"/>
+    <w:qFormat/>
+    <w:rsid w:val="00F8326F"/>
+    <w:pPr>
+      <w:spacing w:before="160"/>
+      <w:jc w:val="center"/>
+    </w:pPr>
+    <w:rPr>
+      <w:i/>
+      <w:iCs/>
+      <w:color w:val="404040" w:themeColor="text1" w:themeTint="BF"/>
+    </w:rPr>
+  </w:style>
+  <w:style w:type="character" w:customStyle="1" w:styleId="CitaCar">
+    <w:name w:val="Cita Car"/>
+    <w:basedOn w:val="Fuentedeprrafopredeter"/>
+    <w:link w:val="Cita"/>
+    <w:uiPriority w:val="29"/>
+    <w:rsid w:val="00F8326F"/>
+    <w:rPr>
+      <w:i/>
+      <w:iCs/>
+      <w:color w:val="404040" w:themeColor="text1" w:themeTint="BF"/>
+    </w:rPr>
+  </w:style>
+  <w:style w:type="paragraph" w:styleId="Prrafodelista">
+    <w:name w:val="List Paragraph"/>
+    <w:basedOn w:val="Normal"/>
+    <w:uiPriority w:val="34"/>
+    <w:qFormat/>
+    <w:rsid w:val="00F8326F"/>
+    <w:pPr>
+      <w:ind w:left="720"/>
+      <w:contextualSpacing/>
+    </w:pPr>
+  </w:style>
+  <w:style w:type="character" w:styleId="nfasisintenso">
+    <w:name w:val="Intense Emphasis"/>
+    <w:basedOn w:val="Fuentedeprrafopredeter"/>
+    <w:uiPriority w:val="21"/>
+    <w:qFormat/>
+    <w:rsid w:val="00F8326F"/>
+    <w:rPr>
+      <w:i/>
+      <w:iCs/>
+      <w:color w:val="0F4761" w:themeColor="accent1" w:themeShade="BF"/>
+    </w:rPr>
+  </w:style>
+  <w:style w:type="paragraph" w:styleId="Citadestacada">
+    <w:name w:val="Intense Quote"/>
+    <w:basedOn w:val="Normal"/>
+    <w:next w:val="Normal"/>
+    <w:link w:val="CitadestacadaCar"/>
+    <w:uiPriority w:val="30"/>
+    <w:qFormat/>
+    <w:rsid w:val="00F8326F"/>
+    <w:pPr>
+      <w:pBdr>
+        <w:top w:val="single" w:sz="4" w:space="10" w:color="0F4761" w:themeColor="accent1" w:themeShade="BF"/>
+        <w:bottom w:val="single" w:sz="4" w:space="10" w:color="0F4761" w:themeColor="accent1" w:themeShade="BF"/>
+      </w:pBdr>
+      <w:spacing w:before="360" w:after="360"/>
+      <w:ind w:left="864" w:right="864"/>
+      <w:jc w:val="center"/>
+    </w:pPr>
+    <w:rPr>
+      <w:i/>
+      <w:iCs/>
+      <w:color w:val="0F4761" w:themeColor="accent1" w:themeShade="BF"/>
+    </w:rPr>
+  </w:style>
+  <w:style w:type="character" w:customStyle="1" w:styleId="CitadestacadaCar">
+    <w:name w:val="Cita destacada Car"/>
+    <w:basedOn w:val="Fuentedeprrafopredeter"/>
+    <w:link w:val="Citadestacada"/>
+    <w:uiPriority w:val="30"/>
+    <w:rsid w:val="00F8326F"/>
+    <w:rPr>
+      <w:i/>
+      <w:iCs/>
+      <w:color w:val="0F4761" w:themeColor="accent1" w:themeShade="BF"/>
+    </w:rPr>
+  </w:style>
+  <w:style w:type="character" w:styleId="Referenciaintensa">
+    <w:name w:val="Intense Reference"/>
+    <w:basedOn w:val="Fuentedeprrafopredeter"/>
+    <w:uiPriority w:val="32"/>
+    <w:qFormat/>
+    <w:rsid w:val="00F8326F"/>
+    <w:rPr>
+      <w:b/>
+      <w:bCs/>
+      <w:smallCaps/>
+      <w:color w:val="0F4761" w:themeColor="accent1" w:themeShade="BF"/>
+      <w:spacing w:val="5"/>
+    </w:rPr>
+  </w:style>
+  <w:style w:type="paragraph" w:styleId="Encabezado">
+    <w:name w:val="header"/>
+    <w:basedOn w:val="Normal"/>
+    <w:link w:val="EncabezadoCar"/>
+    <w:uiPriority w:val="99"/>
+    <w:unhideWhenUsed/>
+    <w:rsid w:val="00F8326F"/>
+    <w:pPr>
+      <w:tabs>
+        <w:tab w:val="center" w:pos="4252"/>
+        <w:tab w:val="right" w:pos="8504"/>
+      </w:tabs>
+      <w:spacing w:after="0" w:line="240" w:lineRule="auto"/>
+    </w:pPr>
+  </w:style>
+  <w:style w:type="character" w:customStyle="1" w:styleId="EncabezadoCar">
+    <w:name w:val="Encabezado Car"/>
+    <w:basedOn w:val="Fuentedeprrafopredeter"/>
+    <w:link w:val="Encabezado"/>
+    <w:uiPriority w:val="99"/>
+    <w:rsid w:val="00F8326F"/>
+  </w:style>
+  <w:style w:type="paragraph" w:styleId="Piedepgina">
+    <w:name w:val="footer"/>
+    <w:basedOn w:val="Normal"/>
+    <w:link w:val="PiedepginaCar"/>
+    <w:uiPriority w:val="99"/>
+    <w:unhideWhenUsed/>
+    <w:rsid w:val="00F8326F"/>
+    <w:pPr>
+      <w:tabs>
+        <w:tab w:val="center" w:pos="4252"/>
+        <w:tab w:val="right" w:pos="8504"/>
+      </w:tabs>
+      <w:spacing w:after="0" w:line="240" w:lineRule="auto"/>
+    </w:pPr>
+  </w:style>
+  <w:style w:type="character" w:customStyle="1" w:styleId="PiedepginaCar">
+    <w:name w:val="Pie de página Car"/>
+    <w:basedOn w:val="Fuentedeprrafopredeter"/>
+    <w:link w:val="Piedepgina"/>
+    <w:uiPriority w:val="99"/>
+    <w:rsid w:val="00F8326F"/>
   </w:style>
 </w:styles>
 </file>
@@ -23664,39 +24359,39 @@
         <a:sysClr val="window" lastClr="FFFFFF"/>
       </a:lt1>
       <a:dk2>
-        <a:srgbClr val="44546A"/>
+        <a:srgbClr val="0E2841"/>
       </a:dk2>
       <a:lt2>
-        <a:srgbClr val="E7E6E6"/>
+        <a:srgbClr val="E8E8E8"/>
       </a:lt2>
       <a:accent1>
-        <a:srgbClr val="4472C4"/>
+        <a:srgbClr val="156082"/>
       </a:accent1>
       <a:accent2>
-        <a:srgbClr val="ED7D31"/>
+        <a:srgbClr val="E97132"/>
       </a:accent2>
       <a:accent3>
-        <a:srgbClr val="A5A5A5"/>
+        <a:srgbClr val="196B24"/>
       </a:accent3>
       <a:accent4>
-        <a:srgbClr val="FFC000"/>
+        <a:srgbClr val="0F9ED5"/>
       </a:accent4>
       <a:accent5>
-        <a:srgbClr val="5B9BD5"/>
+        <a:srgbClr val="A02B93"/>
       </a:accent5>
       <a:accent6>
-        <a:srgbClr val="70AD47"/>
+        <a:srgbClr val="4EA72E"/>
       </a:accent6>
       <a:hlink>
-        <a:srgbClr val="0563C1"/>
+        <a:srgbClr val="467886"/>
       </a:hlink>
       <a:folHlink>
-        <a:srgbClr val="954F72"/>
+        <a:srgbClr val="96607D"/>
       </a:folHlink>
     </a:clrScheme>
     <a:fontScheme name="Office">
       <a:majorFont>
-        <a:latin typeface="Calibri Light" panose="020F0302020204030204"/>
+        <a:latin typeface="Aptos Display" panose="02110004020202020204"/>
         <a:ea typeface=""/>
         <a:cs typeface=""/>
         <a:font script="Jpan" typeface="游ゴシック Light"/>
@@ -23748,7 +24443,7 @@
         <a:font script="Tfng" typeface="Ebrima"/>
       </a:majorFont>
       <a:minorFont>
-        <a:latin typeface="Calibri" panose="020F0502020204030204"/>
+        <a:latin typeface="Aptos" panose="02110004020202020204"/>
         <a:ea typeface=""/>
         <a:cs typeface=""/>
         <a:font script="Jpan" typeface="游明朝"/>
@@ -23805,7 +24500,7 @@
         <a:solidFill>
           <a:schemeClr val="phClr"/>
         </a:solidFill>
-        <a:gradFill rotWithShape="true">
+        <a:gradFill rotWithShape="1">
           <a:gsLst>
             <a:gs pos="0">
               <a:schemeClr val="phClr">
@@ -23829,9 +24524,9 @@
               </a:schemeClr>
             </a:gs>
           </a:gsLst>
-          <a:lin ang="5400000" scaled="false"/>
+          <a:lin ang="5400000" scaled="0"/>
         </a:gradFill>
-        <a:gradFill rotWithShape="true">
+        <a:gradFill rotWithShape="1">
           <a:gsLst>
             <a:gs pos="0">
               <a:schemeClr val="phClr">
@@ -23855,17 +24550,10 @@
               </a:schemeClr>
             </a:gs>
           </a:gsLst>
-          <a:lin ang="5400000" scaled="false"/>
+          <a:lin ang="5400000" scaled="0"/>
         </a:gradFill>
       </a:fillStyleLst>
       <a:lnStyleLst>
-        <a:ln w="6350" cap="flat" cmpd="sng" algn="ctr">
-          <a:solidFill>
-            <a:schemeClr val="phClr"/>
-          </a:solidFill>
-          <a:prstDash val="solid"/>
-          <a:miter lim="800000"/>
-        </a:ln>
         <a:ln w="12700" cap="flat" cmpd="sng" algn="ctr">
           <a:solidFill>
             <a:schemeClr val="phClr"/>
@@ -23874,6 +24562,13 @@
           <a:miter lim="800000"/>
         </a:ln>
         <a:ln w="19050" cap="flat" cmpd="sng" algn="ctr">
+          <a:solidFill>
+            <a:schemeClr val="phClr"/>
+          </a:solidFill>
+          <a:prstDash val="solid"/>
+          <a:miter lim="800000"/>
+        </a:ln>
+        <a:ln w="25400" cap="flat" cmpd="sng" algn="ctr">
           <a:solidFill>
             <a:schemeClr val="phClr"/>
           </a:solidFill>
@@ -23890,7 +24585,7 @@
         </a:effectStyle>
         <a:effectStyle>
           <a:effectLst>
-            <a:outerShdw blurRad="57150" dist="19050" dir="5400000" algn="ctr" rotWithShape="false">
+            <a:outerShdw blurRad="57150" dist="19050" dir="5400000" algn="ctr" rotWithShape="0">
               <a:srgbClr val="000000">
                 <a:alpha val="63000"/>
               </a:srgbClr>
@@ -23908,7 +24603,7 @@
             <a:satMod val="170000"/>
           </a:schemeClr>
         </a:solidFill>
-        <a:gradFill rotWithShape="true">
+        <a:gradFill rotWithShape="1">
           <a:gsLst>
             <a:gs pos="0">
               <a:schemeClr val="phClr">
@@ -23933,12 +24628,37 @@
               </a:schemeClr>
             </a:gs>
           </a:gsLst>
-          <a:lin ang="5400000" scaled="false"/>
+          <a:lin ang="5400000" scaled="0"/>
         </a:gradFill>
       </a:bgFillStyleLst>
     </a:fmtScheme>
   </a:themeElements>
-  <a:objectDefaults/>
+  <a:objectDefaults>
+    <a:lnDef>
+      <a:spPr/>
+      <a:bodyPr/>
+      <a:lstStyle/>
+      <a:style>
+        <a:lnRef idx="2">
+          <a:schemeClr val="accent1"/>
+        </a:lnRef>
+        <a:fillRef idx="0">
+          <a:schemeClr val="accent1"/>
+        </a:fillRef>
+        <a:effectRef idx="1">
+          <a:schemeClr val="accent1"/>
+        </a:effectRef>
+        <a:fontRef idx="minor">
+          <a:schemeClr val="tx1"/>
+        </a:fontRef>
+      </a:style>
+    </a:lnDef>
+  </a:objectDefaults>
   <a:extraClrSchemeLst/>
+  <a:extLst>
+    <a:ext uri="{05A4C25C-085E-4340-85A3-A5531E510DB2}">
+      <thm15:themeFamily xmlns:thm15="http://schemas.microsoft.com/office/thememl/2012/main" name="Office Theme" id="{2E142A2C-CD16-42D6-873A-C26D2A0506FA}" vid="{1BDDFF52-6CD6-40A5-AB3C-68EB2F1E4D0A}"/>
+    </a:ext>
+  </a:extLst>
 </a:theme>
 </file>
</xml_diff>

<commit_message>
docs: presentación y guion del video de la Guía 7 para que lo grabe Samuel
Co-Authored-By: Claude Opus 5.5 <noreply@anthropic.com>
</commit_message>
<xml_diff>
--- a/docs/guia07/Informe_Guia07_Estandares_EcoRecicla_UMB.docx
+++ b/docs/guia07/Informe_Guia07_Estandares_EcoRecicla_UMB.docx
@@ -16497,7 +16497,29 @@
         <w:ind w:firstLine="720"/>
       </w:pPr>
       <w:r>
-        <w:t xml:space="preserve">El video en inglés, de entre 1 y 3 minutos, resume el marco teórico, la consulta del trabajo autónomo y el código desarrollado en las sesiones prácticas. Su guion, de 334 palabras (unos 2 minutos y 35 segundos a ritmo pausado), se incluye en el Anexo C y en </w:t>
+        <w:t xml:space="preserve">El video en inglés, de entre 1 y 3 minutos, resume el marco teórico, la consulta del trabajo autónomo y el código desarrollado en las sesiones prácticas. Lo presenta Samuel Ossa Escobar. Para que no haya que abrir GitHub ni el editor durante la grabación, se preparó una presentación de 9 diapositivas en inglés (</w:t>
+      </w:r>
+      <w:r>
+        <w:rPr>
+          <w:rFonts w:ascii="Courier New" w:cs="Courier New" w:eastAsia="Courier New" w:hAnsi="Courier New"/>
+          <w:sz w:val="22"/>
+          <w:szCs w:val="22"/>
+        </w:rPr>
+        <w:t xml:space="preserve">docs/guia07/Video_Guia07_EcoRecicla.pptx</w:t>
+      </w:r>
+      <w:r>
+        <w:t xml:space="preserve">) que ya contiene los pantallazos necesarios: pull requests, grafo de ramas, conflicto resuelto, código de las pruebas, corridas de GitHub Actions, issues de defectos y salida de </w:t>
+      </w:r>
+      <w:r>
+        <w:rPr>
+          <w:rFonts w:ascii="Courier New" w:cs="Courier New" w:eastAsia="Courier New" w:hAnsi="Courier New"/>
+          <w:sz w:val="22"/>
+          <w:szCs w:val="22"/>
+        </w:rPr>
+        <w:t xml:space="preserve">npm test</w:t>
+      </w:r>
+      <w:r>
+        <w:t xml:space="preserve">. El guion, de 356 palabras (unos 2 minutos y 45 segundos a ritmo pausado), va en las notas del orador de cada diapositiva, en </w:t>
       </w:r>
       <w:r>
         <w:rPr>
@@ -16508,7 +16530,7 @@
         <w:t xml:space="preserve">docs/guia07/guion_video_en.md</w:t>
       </w:r>
       <w:r>
-        <w:t xml:space="preserve">, con la indicación de qué pantalla mostrar en cada parte.</w:t>
+        <w:t xml:space="preserve"> y en el Anexo C.</w:t>
       </w:r>
     </w:p>
     <w:p>
@@ -17346,6 +17368,69 @@
                 <w:szCs w:val="20"/>
               </w:rPr>
               <w:t xml:space="preserve">docs/guia07/Exposicion_ISO9000_EcoRecicla.pptx</w:t>
+            </w:r>
+          </w:p>
+        </w:tc>
+      </w:tr>
+      <w:tr>
+        <w:trPr>
+          <w:cantSplit/>
+        </w:trPr>
+        <w:tc>
+          <w:tcPr>
+            <w:tcW w:type="dxa" w:w="3300"/>
+            <w:tcBorders>
+              <w:top w:val="none" w:color="FFFFFF" w:sz="0"/>
+              <w:left w:val="none" w:color="FFFFFF" w:sz="0"/>
+              <w:bottom w:val="single" w:color="BFBFBF" w:sz="2"/>
+              <w:right w:val="none" w:color="FFFFFF" w:sz="0"/>
+            </w:tcBorders>
+            <w:tcMar>
+              <w:top w:type="dxa" w:w="40"/>
+              <w:left w:type="dxa" w:w="90"/>
+              <w:bottom w:type="dxa" w:w="40"/>
+              <w:right w:type="dxa" w:w="90"/>
+            </w:tcMar>
+          </w:tcPr>
+          <w:p>
+            <w:pPr>
+              <w:spacing w:after="0" w:line="240"/>
+            </w:pPr>
+            <w:r>
+              <w:rPr>
+                <w:sz w:val="20"/>
+                <w:szCs w:val="20"/>
+              </w:rPr>
+              <w:t xml:space="preserve">Presentación para grabar el video</w:t>
+            </w:r>
+          </w:p>
+        </w:tc>
+        <w:tc>
+          <w:tcPr>
+            <w:tcW w:type="dxa" w:w="6060"/>
+            <w:tcBorders>
+              <w:top w:val="none" w:color="FFFFFF" w:sz="0"/>
+              <w:left w:val="none" w:color="FFFFFF" w:sz="0"/>
+              <w:bottom w:val="single" w:color="BFBFBF" w:sz="2"/>
+              <w:right w:val="none" w:color="FFFFFF" w:sz="0"/>
+            </w:tcBorders>
+            <w:tcMar>
+              <w:top w:type="dxa" w:w="40"/>
+              <w:left w:type="dxa" w:w="90"/>
+              <w:bottom w:type="dxa" w:w="40"/>
+              <w:right w:type="dxa" w:w="90"/>
+            </w:tcMar>
+          </w:tcPr>
+          <w:p>
+            <w:pPr>
+              <w:spacing w:after="0" w:line="240"/>
+            </w:pPr>
+            <w:r>
+              <w:rPr>
+                <w:sz w:val="20"/>
+                <w:szCs w:val="20"/>
+              </w:rPr>
+              <w:t xml:space="preserve">docs/guia07/Video_Guia07_EcoRecicla.pptx</w:t>
             </w:r>
           </w:p>
         </w:tc>
@@ -23125,143 +23210,176 @@
     </w:p>
     <w:p>
       <w:r>
-        <w:t xml:space="preserve">Guía 7, Estándares y Métricas de Calidad de Software. Speakers: David Zambrano (D) and Samuel Ossa (S).</w:t>
+        <w:t xml:space="preserve">Guía 7, Estándares y Métricas de Calidad de Software. Speaker: Samuel Ossa Escobar.</w:t>
       </w:r>
     </w:p>
     <w:p>
       <w:r>
-        <w:t xml:space="preserve">Read at a calm pace (about 130 words per minute). Show the screen indicated in brackets.</w:t>
+        <w:t xml:space="preserve">How to record: open </w:t>
+      </w:r>
+      <w:r>
+        <w:rPr>
+          <w:rFonts w:ascii="Courier New" w:cs="Courier New" w:eastAsia="Courier New" w:hAnsi="Courier New"/>
+          <w:sz w:val="22"/>
+          <w:szCs w:val="22"/>
+        </w:rPr>
+        <w:t xml:space="preserve">Video_Guia07_EcoRecicla.pptx</w:t>
+      </w:r>
+      <w:r>
+        <w:t xml:space="preserve"> in slide show mode, start the screen recording and read one block per slide. Everything that must be shown is already on the slides, so there is no need to open GitHub or VS Code. Speak calmly (about 130 words per minute). The same text is in the speaker notes of each slide.</w:t>
       </w:r>
     </w:p>
     <w:p>
-      <w:r>
-        <w:t xml:space="preserve">[Slide 1, title]</w:t>
-      </w:r>
-    </w:p>
-    <w:p>
+      <w:pPr>
+        <w:keepNext/>
+      </w:pPr>
       <w:r>
         <w:rPr>
           <w:b/>
           <w:bCs/>
         </w:rPr>
-        <w:t xml:space="preserve">D:</w:t>
-      </w:r>
-      <w:r>
-        <w:t xml:space="preserve"> Hi, we are David Zambrano and Samuel Ossa, and this is our summary of Lab Guide 7, about quality standards, version control and software testing, applied to EcoRecicla, our recycling web app for Bogotá.</w:t>
+        <w:t xml:space="preserve">Slide 1 (title)</w:t>
       </w:r>
     </w:p>
     <w:p>
       <w:r>
-        <w:t xml:space="preserve">[Slide 3, ISO 9000 family]</w:t>
+        <w:t xml:space="preserve">Hi, I'm Samuel Ossa. With my teammate David Zambrano, I will summarize Lab Guide 7: quality standards, version control and software testing, applied to EcoRecicla, our recycling web app for Bogotá.</w:t>
       </w:r>
     </w:p>
     <w:p>
+      <w:pPr>
+        <w:keepNext/>
+      </w:pPr>
       <w:r>
         <w:rPr>
           <w:b/>
           <w:bCs/>
         </w:rPr>
-        <w:t xml:space="preserve">S:</w:t>
-      </w:r>
-      <w:r>
-        <w:t xml:space="preserve"> First, the theory. ISO 9000 gives the principles and the vocabulary of quality management. ISO 9001 is the only certifiable standard of the family, and its new edition, ISO 9001:2026, was published in September. One of its main changes is stronger control of changes. ISO 9002 and 9003 were withdrawn in 2000. The big lesson is to move from inspecting at the end to preventing during the whole process.</w:t>
+        <w:t xml:space="preserve">Slide 2 (ISO 9000)</w:t>
       </w:r>
     </w:p>
     <w:p>
       <w:r>
-        <w:t xml:space="preserve">[Slide 2, three levels]</w:t>
+        <w:t xml:space="preserve">First, the theory. ISO 9000 gives the principles and the vocabulary of quality management, and ISO 9001 is the only certifiable standard of the family. Its new edition, published in September 2026, asks for a stronger control of changes. The big lesson is to move from inspecting at the end to preventing during the whole process.</w:t>
       </w:r>
     </w:p>
     <w:p>
+      <w:pPr>
+        <w:keepNext/>
+      </w:pPr>
       <w:r>
         <w:rPr>
           <w:b/>
           <w:bCs/>
         </w:rPr>
-        <w:t xml:space="preserve">D:</w:t>
-      </w:r>
-      <w:r>
-        <w:t xml:space="preserve"> In our independent research we found that not all ISO standards follow the high-level structure: only management system standards, like ISO 9001 or ISO 27001, do. Product standards, like ISO/IEC 25010, and testing standards, like ISO/IEC/IEEE 29119, do not. In Colombia, companies such as Perficient Latin America and Heinsohn reached CMMI level 5. These certifications do not test software, but they require evidence, and testing produces that evidence.</w:t>
+        <w:t xml:space="preserve">Slide 3 (independent research)</w:t>
       </w:r>
     </w:p>
     <w:p>
       <w:r>
-        <w:t xml:space="preserve">[GitHub: pull requests and network graph]</w:t>
+        <w:t xml:space="preserve">In our research we found that not all ISO standards follow the high-level structure: only management system standards, like ISO 9001, do. In Colombia, companies such as Perficient Latin America and Heinsohn reached CMMI level 5. These certifications do not test software, but they require evidence, and testing produces that evidence.</w:t>
       </w:r>
     </w:p>
     <w:p>
+      <w:pPr>
+        <w:keepNext/>
+      </w:pPr>
       <w:r>
         <w:rPr>
           <w:b/>
           <w:bCs/>
         </w:rPr>
-        <w:t xml:space="preserve">S:</w:t>
-      </w:r>
-      <w:r>
-        <w:t xml:space="preserve"> In session one we practiced version control with Git and GitHub. Every change follows six steps: issue, branch, commits, pull request, automatic tests with review, and merge. We also created a real merge conflict, editing the same README line from two branches, and solved it by hand.</w:t>
+        <w:t xml:space="preserve">Slide 4 (version control)</w:t>
       </w:r>
     </w:p>
     <w:p>
       <w:r>
-        <w:t xml:space="preserve">[VS Code: tests folder, then GitHub Actions runs]</w:t>
+        <w:t xml:space="preserve">In session one we practiced version control with Git and GitHub. Every change follows six steps: issue, branch, commits, pull request, automatic tests with review, and merge. Here are our pull requests and the branch graph.</w:t>
       </w:r>
     </w:p>
     <w:p>
+      <w:pPr>
+        <w:keepNext/>
+      </w:pPr>
       <w:r>
         <w:rPr>
           <w:b/>
           <w:bCs/>
         </w:rPr>
-        <w:t xml:space="preserve">D:</w:t>
-      </w:r>
-      <w:r>
-        <w:t xml:space="preserve"> In sessions two and three we executed our test plan. We wrote ninety automated tests with Jest and Supertest, running against an isolated test database. GitHub Actions runs them on every pull request with MySQL 8. The first run failed ten cases and revealed five real defects. For example, a quantity of 0.004 kilograms returned an internal server error, and a date like February 30 was accepted.</w:t>
+        <w:t xml:space="preserve">Slide 5 (merge conflict)</w:t>
       </w:r>
     </w:p>
     <w:p>
       <w:r>
-        <w:t xml:space="preserve">[GitHub: closed issues]</w:t>
+        <w:t xml:space="preserve">We also created a real merge conflict. Two branches changed the same line of the README. Git marked the conflict, and we solved it by hand, combining both changes.</w:t>
       </w:r>
     </w:p>
     <w:p>
+      <w:pPr>
+        <w:keepNext/>
+      </w:pPr>
       <w:r>
         <w:rPr>
           <w:b/>
           <w:bCs/>
         </w:rPr>
-        <w:t xml:space="preserve">S:</w:t>
-      </w:r>
-      <w:r>
-        <w:t xml:space="preserve"> Each defect became a GitHub issue, was fixed in its own branch, and was tested again. Now all ninety tests pass and line coverage is eighty-two percent.</w:t>
+        <w:t xml:space="preserve">Slide 6 (automated tests)</w:t>
       </w:r>
     </w:p>
     <w:p>
       <w:r>
-        <w:t xml:space="preserve">[Slide 10, closing]</w:t>
+        <w:t xml:space="preserve">In sessions two and three we executed our test plan. We wrote ninety automated tests with Jest and Supertest. This test checks the limits of the recycled quantity: valid values must be saved, and invalid values must be rejected without saving anything.</w:t>
       </w:r>
     </w:p>
     <w:p>
+      <w:pPr>
+        <w:keepNext/>
+      </w:pPr>
       <w:r>
         <w:rPr>
           <w:b/>
           <w:bCs/>
         </w:rPr>
-        <w:t xml:space="preserve">D:</w:t>
-      </w:r>
-      <w:r>
-        <w:t xml:space="preserve"> Our conclusion: ISO 9000 does not test the software, but it asks us to prove quality with evidence.</w:t>
+        <w:t xml:space="preserve">Slide 7 (continuous integration)</w:t>
       </w:r>
     </w:p>
     <w:p>
+      <w:r>
+        <w:t xml:space="preserve">GitHub Actions runs all the tests on every pull request with MySQL 8. The first run failed and revealed five real defects. For example, a quantity of 0.004 kilograms caused an internal server error, and a date like February 30 was accepted.</w:t>
+      </w:r>
+    </w:p>
+    <w:p>
+      <w:pPr>
+        <w:keepNext/>
+      </w:pPr>
       <w:r>
         <w:rPr>
           <w:b/>
           <w:bCs/>
         </w:rPr>
-        <w:t xml:space="preserve">S:</w:t>
-      </w:r>
-      <w:r>
-        <w:t xml:space="preserve"> Thank you for watching.</w:t>
+        <w:t xml:space="preserve">Slide 8 (defects and fixes)</w:t>
+      </w:r>
+    </w:p>
+    <w:p>
+      <w:r>
+        <w:t xml:space="preserve">Each defect became a GitHub issue, was fixed in its own branch and was tested again. This is the fix for the dates: it rebuilds the date and checks that it really exists in the calendar.</w:t>
+      </w:r>
+    </w:p>
+    <w:p>
+      <w:pPr>
+        <w:keepNext/>
+      </w:pPr>
+      <w:r>
+        <w:rPr>
+          <w:b/>
+          <w:bCs/>
+        </w:rPr>
+        <w:t xml:space="preserve">Slide 9 (results and conclusion)</w:t>
+      </w:r>
+    </w:p>
+    <w:p>
+      <w:r>
+        <w:t xml:space="preserve">Now all ninety tests pass, and line coverage is eighty-two percent. Our conclusion: ISO 9000 does not test the software, but it asks us to prove quality with evidence. Thank you for watching.</w:t>
       </w:r>
     </w:p>
     <w:sectPr>

</xml_diff>